<commit_message>
Add DSE ICT past papers and improve S5 ICT exam02 generation.
Include HKDSE ICT PDF archive, DSE-style phrasing helpers, and updated
25_26_S5_ICT_Exam02 spec/DOCX with refined MCQ wording and combo options.

Co-authored-by: Cursor <cursoragent@cursor.com>
</commit_message>
<xml_diff>
--- a/Subjects/PastPaper/CMP+ICT/2025-2026/S5 ICT/25_26_S5_ICT_Exam02.docx
+++ b/Subjects/PastPaper/CMP+ICT/2025-2026/S5 ICT/25_26_S5_ICT_Exam02.docx
@@ -1908,7 +1908,7 @@
         <w:tab/>
         <w:t>A.</w:t>
         <w:tab/>
-        <w:t>0xA5</w:t>
+        <w:t>0x5C</w:t>
       </w:r>
     </w:p>
     <w:p>
@@ -1954,7 +1954,7 @@
         <w:tab/>
         <w:t>C.</w:t>
         <w:tab/>
-        <w:t>0x5C</w:t>
+        <w:t>0xA5</w:t>
       </w:r>
     </w:p>
     <w:p>
@@ -2036,7 +2036,7 @@
         </w:rPr>
       </w:pPr>
       <w:r>
-        <w:t>以 8 位元二進制補碼表示十進位 -3，下列哪一項正確？</w:t>
+        <w:t>以 8 位元二進制補碼表示十進位 -3，下列哪項正確？</w:t>
       </w:r>
     </w:p>
     <w:p>
@@ -2204,7 +2204,7 @@
         </w:rPr>
       </w:pPr>
       <w:r>
-        <w:t>關於 ASCII 與 Unicode（UTF-8）儲存中文，下列敘述何者最恰當？</w:t>
+        <w:t>下列哪句關於 ASCII 與 Unicode（UTF-8）儲存中文，何者正確？</w:t>
       </w:r>
     </w:p>
     <w:p>
@@ -2244,7 +2244,7 @@
         <w:tab/>
         <w:t>A.</w:t>
         <w:tab/>
-        <w:t>UTF-8 的中文字通常比 ASCII 編碼佔更多字節</w:t>
+        <w:t>ASCII 可完整表示所有繁體中文字</w:t>
       </w:r>
     </w:p>
     <w:p>
@@ -2267,7 +2267,7 @@
         <w:tab/>
         <w:t>B.</w:t>
         <w:tab/>
-        <w:t>ASCII 可完整表示所有繁體中文字</w:t>
+        <w:t>UTF-8 的中文字通常比 ASCII 編碼佔更多字節</w:t>
       </w:r>
     </w:p>
     <w:p>
@@ -2412,7 +2412,7 @@
         <w:tab/>
         <w:t>A.</w:t>
         <w:tab/>
-        <w:t>約 352 KB</w:t>
+        <w:t>約 176 KB</w:t>
       </w:r>
     </w:p>
     <w:p>
@@ -2435,7 +2435,7 @@
         <w:tab/>
         <w:t>B.</w:t>
         <w:tab/>
-        <w:t>約 88 KB</w:t>
+        <w:t>約 352 KB</w:t>
       </w:r>
     </w:p>
     <w:p>
@@ -2458,7 +2458,7 @@
         <w:tab/>
         <w:t>C.</w:t>
         <w:tab/>
-        <w:t>約 176 KB</w:t>
+        <w:t>約 88 KB</w:t>
       </w:r>
     </w:p>
     <w:p>
@@ -2603,7 +2603,7 @@
         <w:tab/>
         <w:t>B.</w:t>
         <w:tab/>
-        <w:t>將文字轉為日期格式</w:t>
+        <w:t>計算滿足多條件的個數</w:t>
       </w:r>
     </w:p>
     <w:p>
@@ -2626,7 +2626,7 @@
         <w:tab/>
         <w:t>C.</w:t>
         <w:tab/>
-        <w:t>計算滿足多條件的個數</w:t>
+        <w:t>合併儲存格</w:t>
       </w:r>
     </w:p>
     <w:p>
@@ -2649,7 +2649,7 @@
         <w:tab/>
         <w:t>D.</w:t>
         <w:tab/>
-        <w:t>合併儲存格</w:t>
+        <w:t>將文字轉為日期格式</w:t>
       </w:r>
     </w:p>
     <w:p>
@@ -2700,7 +2700,7 @@
         </w:rPr>
       </w:pPr>
       <w:r>
-        <w:t>老師要統計「同時滿足：班別為甲班、分數&gt;=60」的學生人數。下列哪個函數最適合？</w:t>
+        <w:t>老師要統計「同時滿足：班別為甲班、分數&gt;=60」的學生人數。下列哪項（些）最適合？</w:t>
       </w:r>
     </w:p>
     <w:p>
@@ -2875,7 +2875,7 @@
         <w:tab/>
         <w:t>C.</w:t>
         <w:tab/>
-        <w:t>只有 (3)</w:t>
+        <w:t>只有 (2) 和 (3)</w:t>
       </w:r>
     </w:p>
     <w:p>
@@ -2898,7 +2898,7 @@
         <w:tab/>
         <w:t>D.</w:t>
         <w:tab/>
-        <w:t>(3)（COUNTIFS）最貼切</w:t>
+        <w:t>只有 (3)</w:t>
       </w:r>
     </w:p>
     <w:p>
@@ -2973,7 +2973,7 @@
         </w:rPr>
       </w:pPr>
       <w:r>
-        <w:t>在馮·諾伊曼架構中，快取記憶體（Cache）的主要角色是？下列敘述何者正確？</w:t>
+        <w:t>下列哪句關於快取記憶體（Cache）是正確的？</w:t>
       </w:r>
     </w:p>
     <w:p>
@@ -3054,7 +3054,7 @@
         <w:tab/>
         <w:t>A.</w:t>
         <w:tab/>
-        <w:t>在 CPU 與主記憶體之間提供較小但較快的暫存層以提升效能</w:t>
+        <w:t>用作永久儲存作業系統與使用者文件</w:t>
       </w:r>
     </w:p>
     <w:p>
@@ -3100,7 +3100,7 @@
         <w:tab/>
         <w:t>C.</w:t>
         <w:tab/>
-        <w:t>用作永久儲存作業系統與使用者文件</w:t>
+        <w:t>在 CPU 與主記憶體之間提供較小但較快的暫存層以提升效能</w:t>
       </w:r>
     </w:p>
     <w:p>
@@ -3182,7 +3182,7 @@
         </w:rPr>
       </w:pPr>
       <w:r>
-        <w:t>比較 SSD 與傳統 HDD，下列敘述何者正確？</w:t>
+        <w:t>比較固態硬碟（SSD）與傳統硬碟（HDD），下列哪項（些）句子是正確的？</w:t>
       </w:r>
     </w:p>
     <w:p>
@@ -3440,7 +3440,7 @@
         </w:rPr>
       </w:pPr>
       <w:r>
-        <w:t>下列哪一項最屬於實用程式（Utility）的典型用途？</w:t>
+        <w:t>下列哪項最屬於實用程式（Utility）的典型用途？</w:t>
       </w:r>
     </w:p>
     <w:p>
@@ -3480,7 +3480,7 @@
         <w:tab/>
         <w:t>A.</w:t>
         <w:tab/>
-        <w:t>編寫 SQL 查詢</w:t>
+        <w:t>磁碟重組或檔案壓縮等系統維護工作</w:t>
       </w:r>
     </w:p>
     <w:p>
@@ -3526,7 +3526,7 @@
         <w:tab/>
         <w:t>C.</w:t>
         <w:tab/>
-        <w:t>磁碟重組或檔案壓縮等系統維護工作</w:t>
+        <w:t>編輯數碼影片特效</w:t>
       </w:r>
     </w:p>
     <w:p>
@@ -3549,7 +3549,7 @@
         <w:tab/>
         <w:t>D.</w:t>
         <w:tab/>
-        <w:t>掃描病毒定義更新</w:t>
+        <w:t>管理使用者帳戶與檔案權限</w:t>
       </w:r>
     </w:p>
     <w:p>
@@ -3648,7 +3648,7 @@
         <w:tab/>
         <w:t>A.</w:t>
         <w:tab/>
-        <w:t>約 1.4 MB</w:t>
+        <w:t>約 140 KB</w:t>
       </w:r>
     </w:p>
     <w:p>
@@ -3671,7 +3671,7 @@
         <w:tab/>
         <w:t>B.</w:t>
         <w:tab/>
-        <w:t>約 140 KB</w:t>
+        <w:t>約 1.4 MB</w:t>
       </w:r>
     </w:p>
     <w:p>
@@ -3768,7 +3768,7 @@
         </w:rPr>
       </w:pPr>
       <w:r>
-        <w:t>關於有損與無損壓縮，下列敘述何者最恰當？</w:t>
+        <w:t>下列哪句關於有損與無損壓縮，何者正確？</w:t>
       </w:r>
     </w:p>
     <w:p>
@@ -3808,7 +3808,7 @@
         <w:tab/>
         <w:t>A.</w:t>
         <w:tab/>
-        <w:t>有損壓縮可能犧牲部分畫質／音質以換取較小檔案</w:t>
+        <w:t>無損壓縮常用於 JPEG 相片以縮小檔案</w:t>
       </w:r>
     </w:p>
     <w:p>
@@ -3854,7 +3854,7 @@
         <w:tab/>
         <w:t>C.</w:t>
         <w:tab/>
-        <w:t>兩者均不能減少檔案大小</w:t>
+        <w:t>有損壓縮可能犧牲部分畫質／音質以換取較小檔案</w:t>
       </w:r>
     </w:p>
     <w:p>
@@ -3877,7 +3877,7 @@
         <w:tab/>
         <w:t>D.</w:t>
         <w:tab/>
-        <w:t>無損壓縮常用於 JPEG 相片以縮小檔案</w:t>
+        <w:t>兩者均不能減少檔案大小</w:t>
       </w:r>
     </w:p>
     <w:p>
@@ -3936,7 +3936,7 @@
         </w:rPr>
       </w:pPr>
       <w:r>
-        <w:t>資料表 Order(OrderID, CustomerName, ProductName, UnitPrice, Qty) 中，同一 CustomerName 對應多個 ProductName。下列哪一項最可能違反第一正規化（1NF）？</w:t>
+        <w:t>下列哪句關於「欄位（Field）」是正確的？</w:t>
       </w:r>
     </w:p>
     <w:p>
@@ -3976,7 +3976,7 @@
         <w:tab/>
         <w:t>A.</w:t>
         <w:tab/>
-        <w:t>OrderID 為主鍵</w:t>
+        <w:t>整個資料庫的備份檔</w:t>
       </w:r>
     </w:p>
     <w:p>
@@ -3999,7 +3999,7 @@
         <w:tab/>
         <w:t>B.</w:t>
         <w:tab/>
-        <w:t>UnitPrice 為數值型別</w:t>
+        <w:t>由多個欄位組成的一筆記錄</w:t>
       </w:r>
     </w:p>
     <w:p>
@@ -4022,7 +4022,7 @@
         <w:tab/>
         <w:t>C.</w:t>
         <w:tab/>
-        <w:t>同一列同時儲存多個產品名稱於一個儲存格（以逗號分隔）</w:t>
+        <w:t>儲存同一類資料的最小單位</w:t>
       </w:r>
     </w:p>
     <w:p>
@@ -4045,7 +4045,7 @@
         <w:tab/>
         <w:t>D.</w:t>
         <w:tab/>
-        <w:t>Qty 必須大於 0</w:t>
+        <w:t>CPU 內的快取行</w:t>
       </w:r>
     </w:p>
     <w:p>
@@ -4120,7 +4120,7 @@
         </w:rPr>
       </w:pPr>
       <w:r>
-        <w:t>下列哪一項較屬於強密碼的特徵？</w:t>
+        <w:t>細看以下學號輸入規則：只接受「一個英文字母 + 五個數字」。此輸入會涉及下列哪（些）項目？</w:t>
       </w:r>
     </w:p>
     <w:p>
@@ -4161,7 +4161,7 @@
         <w:tab/>
         <w:t>(1)</w:t>
         <w:tab/>
-        <w:t>混合大小寫、數字與符號</w:t>
+        <w:t>數據有效性檢驗</w:t>
       </w:r>
     </w:p>
     <w:p>
@@ -4185,7 +4185,7 @@
         <w:tab/>
         <w:t>(2)</w:t>
         <w:tab/>
-        <w:t>使用學號作為密碼</w:t>
+        <w:t>奇偶檢測</w:t>
       </w:r>
     </w:p>
     <w:p>
@@ -4209,7 +4209,7 @@
         <w:tab/>
         <w:t>(3)</w:t>
         <w:tab/>
-        <w:t>與用戶名稱相同</w:t>
+        <w:t>順序存取檔案</w:t>
       </w:r>
     </w:p>
     <w:p>
@@ -4272,7 +4272,7 @@
         <w:tab/>
         <w:t>B.</w:t>
         <w:tab/>
-        <w:t>(1) 和 (2)</w:t>
+        <w:t>只有 (1) 和 (2)</w:t>
       </w:r>
     </w:p>
     <w:p>
@@ -4377,7 +4377,7 @@
         </w:rPr>
       </w:pPr>
       <w:r>
-        <w:t>關於惡意軟件，下列配對何者最適當？</w:t>
+        <w:t>下列哪句關於「資訊」與「數據」是正確的？</w:t>
       </w:r>
     </w:p>
     <w:p>
@@ -4417,7 +4417,7 @@
         <w:tab/>
         <w:t>A.</w:t>
         <w:tab/>
-        <w:t>木馬：常偽裝成正常程式誘使使用者執行</w:t>
+        <w:t>經整理後對決策有幫助的內容</w:t>
       </w:r>
     </w:p>
     <w:p>
@@ -4440,7 +4440,7 @@
         <w:tab/>
         <w:t>B.</w:t>
         <w:tab/>
-        <w:t>病毒：常需依附宿主檔案；蠕蟲：常可自我複製並擴散</w:t>
+        <w:t>未經處理的原始符號或數值</w:t>
       </w:r>
     </w:p>
     <w:p>
@@ -4463,7 +4463,7 @@
         <w:tab/>
         <w:t>C.</w:t>
         <w:tab/>
-        <w:t>勒索軟件：只會加快 CPU 風扇</w:t>
+        <w:t>硬碟上的二進制位元</w:t>
       </w:r>
     </w:p>
     <w:p>
@@ -4486,7 +4486,7 @@
         <w:tab/>
         <w:t>D.</w:t>
         <w:tab/>
-        <w:t>蠕蟲：必須依附於試算表巨集且不能自我複製</w:t>
+        <w:t>壓縮演算法中的位元組</w:t>
       </w:r>
     </w:p>
     <w:p>
@@ -4545,261 +4545,7 @@
         </w:rPr>
       </w:pPr>
       <w:r>
-        <w:t>考慮下列片段（變數 count 初值為 0）：</w:t>
-      </w:r>
-    </w:p>
-    <w:p>
-      <w:pPr>
-        <w:tabs>
-          <w:tab w:val="left" w:pos="567"/>
-          <w:tab w:val="left" w:pos="993"/>
-          <w:tab w:val="left" w:pos="1418"/>
-          <w:tab w:val="left" w:pos="1843"/>
-          <w:tab w:val="left" w:pos="2268"/>
-        </w:tabs>
-        <w:snapToGrid w:val="0"/>
-        <w:rPr>
-          <w:spacing w:val="20"/>
-          <w:szCs w:val="20"/>
-        </w:rPr>
-      </w:pPr>
-      <w:r/>
-    </w:p>
-    <w:p>
-      <w:pPr>
-        <w:tabs>
-          <w:tab w:val="left" w:pos="567"/>
-          <w:tab w:val="left" w:pos="993"/>
-          <w:tab w:val="left" w:pos="1418"/>
-          <w:tab w:val="left" w:pos="1843"/>
-          <w:tab w:val="left" w:pos="2268"/>
-        </w:tabs>
-        <w:snapToGrid w:val="0"/>
-        <w:ind w:left="567" w:hanging="567"/>
-        <w:rPr>
-          <w:spacing w:val="20"/>
-          <w:szCs w:val="20"/>
-        </w:rPr>
-      </w:pPr>
-      <w:r>
-        <w:tab/>
-        <w:tab/>
-        <w:t>FOR k ← 1 TO 3</w:t>
-      </w:r>
-    </w:p>
-    <w:p>
-      <w:pPr>
-        <w:tabs>
-          <w:tab w:val="left" w:pos="567"/>
-          <w:tab w:val="left" w:pos="993"/>
-          <w:tab w:val="left" w:pos="1418"/>
-          <w:tab w:val="left" w:pos="1843"/>
-          <w:tab w:val="left" w:pos="2268"/>
-        </w:tabs>
-        <w:snapToGrid w:val="0"/>
-        <w:ind w:left="567" w:hanging="567"/>
-        <w:rPr>
-          <w:spacing w:val="20"/>
-          <w:szCs w:val="20"/>
-        </w:rPr>
-      </w:pPr>
-      <w:r>
-        <w:tab/>
-        <w:tab/>
-        <w:tab/>
-        <w:t>FOR m ← 1 TO 2</w:t>
-      </w:r>
-    </w:p>
-    <w:p>
-      <w:pPr>
-        <w:tabs>
-          <w:tab w:val="left" w:pos="567"/>
-          <w:tab w:val="left" w:pos="993"/>
-          <w:tab w:val="left" w:pos="1418"/>
-          <w:tab w:val="left" w:pos="1843"/>
-          <w:tab w:val="left" w:pos="2268"/>
-        </w:tabs>
-        <w:snapToGrid w:val="0"/>
-        <w:ind w:left="567" w:hanging="567"/>
-        <w:rPr>
-          <w:spacing w:val="20"/>
-          <w:szCs w:val="20"/>
-        </w:rPr>
-      </w:pPr>
-      <w:r>
-        <w:tab/>
-        <w:tab/>
-        <w:tab/>
-        <w:tab/>
-        <w:t>count ← count + 1</w:t>
-      </w:r>
-    </w:p>
-    <w:p>
-      <w:pPr>
-        <w:tabs>
-          <w:tab w:val="left" w:pos="567"/>
-          <w:tab w:val="left" w:pos="993"/>
-          <w:tab w:val="left" w:pos="1418"/>
-          <w:tab w:val="left" w:pos="1843"/>
-          <w:tab w:val="left" w:pos="2268"/>
-        </w:tabs>
-        <w:snapToGrid w:val="0"/>
-        <w:rPr>
-          <w:spacing w:val="20"/>
-          <w:szCs w:val="20"/>
-        </w:rPr>
-      </w:pPr>
-      <w:r/>
-    </w:p>
-    <w:p>
-      <w:pPr>
-        <w:tabs>
-          <w:tab w:val="left" w:pos="567"/>
-          <w:tab w:val="left" w:pos="993"/>
-          <w:tab w:val="left" w:pos="1418"/>
-          <w:tab w:val="left" w:pos="1843"/>
-          <w:tab w:val="left" w:pos="2268"/>
-        </w:tabs>
-        <w:snapToGrid w:val="0"/>
-        <w:ind w:left="567" w:hanging="567"/>
-        <w:rPr>
-          <w:spacing w:val="20"/>
-          <w:szCs w:val="20"/>
-        </w:rPr>
-      </w:pPr>
-      <w:r>
-        <w:tab/>
-        <w:t>A.</w:t>
-        <w:tab/>
-        <w:t>迴圈結束後 count 為 6</w:t>
-      </w:r>
-    </w:p>
-    <w:p>
-      <w:pPr>
-        <w:tabs>
-          <w:tab w:val="left" w:pos="567"/>
-          <w:tab w:val="left" w:pos="993"/>
-          <w:tab w:val="left" w:pos="1418"/>
-          <w:tab w:val="left" w:pos="1843"/>
-          <w:tab w:val="left" w:pos="2268"/>
-        </w:tabs>
-        <w:snapToGrid w:val="0"/>
-        <w:ind w:left="567" w:hanging="567"/>
-        <w:rPr>
-          <w:spacing w:val="20"/>
-          <w:szCs w:val="20"/>
-        </w:rPr>
-      </w:pPr>
-      <w:r>
-        <w:tab/>
-        <w:t>B.</w:t>
-        <w:tab/>
-        <w:t>迴圈結束後 count 為 3</w:t>
-      </w:r>
-    </w:p>
-    <w:p>
-      <w:pPr>
-        <w:tabs>
-          <w:tab w:val="left" w:pos="567"/>
-          <w:tab w:val="left" w:pos="993"/>
-          <w:tab w:val="left" w:pos="1418"/>
-          <w:tab w:val="left" w:pos="1843"/>
-          <w:tab w:val="left" w:pos="2268"/>
-        </w:tabs>
-        <w:snapToGrid w:val="0"/>
-        <w:ind w:left="567" w:hanging="567"/>
-        <w:rPr>
-          <w:spacing w:val="20"/>
-          <w:szCs w:val="20"/>
-        </w:rPr>
-      </w:pPr>
-      <w:r>
-        <w:tab/>
-        <w:t>C.</w:t>
-        <w:tab/>
-        <w:t>迴圈結束後 count 為 9</w:t>
-      </w:r>
-    </w:p>
-    <w:p>
-      <w:pPr>
-        <w:tabs>
-          <w:tab w:val="left" w:pos="567"/>
-          <w:tab w:val="left" w:pos="993"/>
-          <w:tab w:val="left" w:pos="1418"/>
-          <w:tab w:val="left" w:pos="1843"/>
-          <w:tab w:val="left" w:pos="2268"/>
-        </w:tabs>
-        <w:snapToGrid w:val="0"/>
-        <w:ind w:left="567" w:hanging="567"/>
-        <w:rPr>
-          <w:spacing w:val="20"/>
-          <w:szCs w:val="20"/>
-        </w:rPr>
-      </w:pPr>
-      <w:r>
-        <w:tab/>
-        <w:t>D.</w:t>
-        <w:tab/>
-        <w:t>迴圈結束後 count 為 5</w:t>
-      </w:r>
-    </w:p>
-    <w:p>
-      <w:pPr>
-        <w:tabs>
-          <w:tab w:val="left" w:pos="567"/>
-          <w:tab w:val="left" w:pos="993"/>
-          <w:tab w:val="left" w:pos="1418"/>
-          <w:tab w:val="left" w:pos="1843"/>
-          <w:tab w:val="left" w:pos="2268"/>
-        </w:tabs>
-        <w:snapToGrid w:val="0"/>
-        <w:ind w:left="567" w:hanging="567"/>
-        <w:rPr>
-          <w:spacing w:val="20"/>
-          <w:szCs w:val="20"/>
-        </w:rPr>
-      </w:pPr>
-    </w:p>
-    <w:p>
-      <w:pPr>
-        <w:tabs>
-          <w:tab w:val="left" w:pos="567"/>
-          <w:tab w:val="left" w:pos="993"/>
-          <w:tab w:val="left" w:pos="1418"/>
-          <w:tab w:val="left" w:pos="1843"/>
-          <w:tab w:val="left" w:pos="2268"/>
-        </w:tabs>
-        <w:snapToGrid w:val="0"/>
-        <w:ind w:left="567" w:hanging="567"/>
-        <w:rPr>
-          <w:spacing w:val="20"/>
-          <w:szCs w:val="20"/>
-        </w:rPr>
-      </w:pPr>
-    </w:p>
-    <w:p>
-      <w:pPr>
-        <w:pStyle w:val="af3"/>
-        <w:numPr>
-          <w:ilvl w:val="0"/>
-          <w:numId w:val="2"/>
-        </w:numPr>
-        <w:tabs>
-          <w:tab w:val="left" w:pos="567"/>
-          <w:tab w:val="left" w:pos="993"/>
-          <w:tab w:val="left" w:pos="1418"/>
-          <w:tab w:val="left" w:pos="1843"/>
-          <w:tab w:val="left" w:pos="2268"/>
-        </w:tabs>
-        <w:snapToGrid w:val="0"/>
-        <w:ind w:leftChars="0" w:left="567" w:hanging="567"/>
-        <w:rPr>
-          <w:spacing w:val="20"/>
-          <w:szCs w:val="20"/>
-        </w:rPr>
-      </w:pPr>
-      <w:r>
-        <w:t>要找出一組數字中的第三大值，下列哪一種做法較符合「最直接」的解難方向？</w:t>
+        <w:t>下列哪項（些）關於 RAM 與 ROM 的句子是正確的？</w:t>
       </w:r>
     </w:p>
     <w:p>
@@ -4840,7 +4586,7 @@
         <w:tab/>
         <w:t>(1)</w:t>
         <w:tab/>
-        <w:t>先排序再取適當位置的值</w:t>
+        <w:t>RAM 通常可讀寫且斷電後內容可能消失</w:t>
       </w:r>
     </w:p>
     <w:p>
@@ -4864,7 +4610,7 @@
         <w:tab/>
         <w:t>(2)</w:t>
         <w:tab/>
-        <w:t>把所有數字相加</w:t>
+        <w:t>ROM 通常用於儲存開機程式</w:t>
       </w:r>
     </w:p>
     <w:p>
@@ -4888,7 +4634,7 @@
         <w:tab/>
         <w:t>(3)</w:t>
         <w:tab/>
-        <w:t>只比較前兩個數字</w:t>
+        <w:t>RAM 用作永久儲存使用者文件</w:t>
       </w:r>
     </w:p>
     <w:p>
@@ -4901,7 +4647,6 @@
           <w:tab w:val="left" w:pos="2268"/>
         </w:tabs>
         <w:snapToGrid w:val="0"/>
-        <w:ind w:left="567" w:hanging="567"/>
         <w:rPr>
           <w:spacing w:val="20"/>
           <w:szCs w:val="20"/>
@@ -4952,7 +4697,7 @@
         <w:tab/>
         <w:t>B.</w:t>
         <w:tab/>
-        <w:t>(1) 較合理（視演算法而定）</w:t>
+        <w:t>只有 (1) 和 (2)</w:t>
       </w:r>
     </w:p>
     <w:p>
@@ -4975,7 +4720,1460 @@
         <w:tab/>
         <w:t>C.</w:t>
         <w:tab/>
-        <w:t>只有 (2)</w:t>
+        <w:t>只有 (3)</w:t>
+      </w:r>
+    </w:p>
+    <w:p>
+      <w:pPr>
+        <w:tabs>
+          <w:tab w:val="left" w:pos="567"/>
+          <w:tab w:val="left" w:pos="993"/>
+          <w:tab w:val="left" w:pos="1418"/>
+          <w:tab w:val="left" w:pos="1843"/>
+          <w:tab w:val="left" w:pos="2268"/>
+        </w:tabs>
+        <w:snapToGrid w:val="0"/>
+        <w:ind w:left="567" w:hanging="567"/>
+        <w:rPr>
+          <w:spacing w:val="20"/>
+          <w:szCs w:val="20"/>
+        </w:rPr>
+      </w:pPr>
+      <w:r>
+        <w:tab/>
+        <w:t>D.</w:t>
+        <w:tab/>
+        <w:t>(1)、(2) 和 (3)</w:t>
+      </w:r>
+    </w:p>
+    <w:p>
+      <w:pPr>
+        <w:tabs>
+          <w:tab w:val="left" w:pos="567"/>
+          <w:tab w:val="left" w:pos="993"/>
+          <w:tab w:val="left" w:pos="1418"/>
+          <w:tab w:val="left" w:pos="1843"/>
+          <w:tab w:val="left" w:pos="2268"/>
+        </w:tabs>
+        <w:snapToGrid w:val="0"/>
+        <w:ind w:left="567" w:hanging="567"/>
+        <w:rPr>
+          <w:spacing w:val="20"/>
+          <w:szCs w:val="20"/>
+        </w:rPr>
+      </w:pPr>
+    </w:p>
+    <w:p>
+      <w:pPr>
+        <w:tabs>
+          <w:tab w:val="left" w:pos="567"/>
+          <w:tab w:val="left" w:pos="993"/>
+          <w:tab w:val="left" w:pos="1418"/>
+          <w:tab w:val="left" w:pos="1843"/>
+          <w:tab w:val="left" w:pos="2268"/>
+        </w:tabs>
+        <w:snapToGrid w:val="0"/>
+        <w:ind w:left="567" w:hanging="567"/>
+        <w:rPr>
+          <w:spacing w:val="20"/>
+          <w:szCs w:val="20"/>
+        </w:rPr>
+      </w:pPr>
+    </w:p>
+    <w:p>
+      <w:pPr>
+        <w:pStyle w:val="af3"/>
+        <w:numPr>
+          <w:ilvl w:val="0"/>
+          <w:numId w:val="2"/>
+        </w:numPr>
+        <w:tabs>
+          <w:tab w:val="left" w:pos="567"/>
+          <w:tab w:val="left" w:pos="993"/>
+          <w:tab w:val="left" w:pos="1418"/>
+          <w:tab w:val="left" w:pos="1843"/>
+          <w:tab w:val="left" w:pos="2268"/>
+        </w:tabs>
+        <w:snapToGrid w:val="0"/>
+        <w:ind w:leftChars="0" w:left="567" w:hanging="567"/>
+        <w:rPr>
+          <w:spacing w:val="20"/>
+          <w:szCs w:val="20"/>
+        </w:rPr>
+      </w:pPr>
+      <w:r>
+        <w:t>下列哪項（些）輸入裝置與用途的配對是正確的？</w:t>
+      </w:r>
+    </w:p>
+    <w:p>
+      <w:pPr>
+        <w:tabs>
+          <w:tab w:val="left" w:pos="567"/>
+          <w:tab w:val="left" w:pos="993"/>
+          <w:tab w:val="left" w:pos="1418"/>
+          <w:tab w:val="left" w:pos="1843"/>
+          <w:tab w:val="left" w:pos="2268"/>
+        </w:tabs>
+        <w:snapToGrid w:val="0"/>
+        <w:rPr>
+          <w:spacing w:val="20"/>
+          <w:szCs w:val="20"/>
+        </w:rPr>
+      </w:pPr>
+      <w:r/>
+    </w:p>
+    <w:p>
+      <w:pPr>
+        <w:tabs>
+          <w:tab w:val="left" w:pos="567"/>
+          <w:tab w:val="left" w:pos="993"/>
+          <w:tab w:val="left" w:pos="1418"/>
+          <w:tab w:val="left" w:pos="1843"/>
+          <w:tab w:val="left" w:pos="2268"/>
+        </w:tabs>
+        <w:snapToGrid w:val="0"/>
+        <w:ind w:left="567" w:hanging="567"/>
+        <w:rPr>
+          <w:spacing w:val="20"/>
+          <w:szCs w:val="20"/>
+        </w:rPr>
+      </w:pPr>
+      <w:r>
+        <w:tab/>
+        <w:tab/>
+        <w:t>(1)</w:t>
+        <w:tab/>
+        <w:t>條碼掃描器：讀取商品編號</w:t>
+      </w:r>
+    </w:p>
+    <w:p>
+      <w:pPr>
+        <w:tabs>
+          <w:tab w:val="left" w:pos="567"/>
+          <w:tab w:val="left" w:pos="993"/>
+          <w:tab w:val="left" w:pos="1418"/>
+          <w:tab w:val="left" w:pos="1843"/>
+          <w:tab w:val="left" w:pos="2268"/>
+        </w:tabs>
+        <w:snapToGrid w:val="0"/>
+        <w:ind w:left="567" w:hanging="567"/>
+        <w:rPr>
+          <w:spacing w:val="20"/>
+          <w:szCs w:val="20"/>
+        </w:rPr>
+      </w:pPr>
+      <w:r>
+        <w:tab/>
+        <w:tab/>
+        <w:t>(2)</w:t>
+        <w:tab/>
+        <w:t>麥克風：輸入聲音訊號</w:t>
+      </w:r>
+    </w:p>
+    <w:p>
+      <w:pPr>
+        <w:tabs>
+          <w:tab w:val="left" w:pos="567"/>
+          <w:tab w:val="left" w:pos="993"/>
+          <w:tab w:val="left" w:pos="1418"/>
+          <w:tab w:val="left" w:pos="1843"/>
+          <w:tab w:val="left" w:pos="2268"/>
+        </w:tabs>
+        <w:snapToGrid w:val="0"/>
+        <w:ind w:left="567" w:hanging="567"/>
+        <w:rPr>
+          <w:spacing w:val="20"/>
+          <w:szCs w:val="20"/>
+        </w:rPr>
+      </w:pPr>
+      <w:r>
+        <w:tab/>
+        <w:tab/>
+        <w:t>(3)</w:t>
+        <w:tab/>
+        <w:t>繪圖板：輸入位置與壓感</w:t>
+      </w:r>
+    </w:p>
+    <w:p>
+      <w:pPr>
+        <w:tabs>
+          <w:tab w:val="left" w:pos="567"/>
+          <w:tab w:val="left" w:pos="993"/>
+          <w:tab w:val="left" w:pos="1418"/>
+          <w:tab w:val="left" w:pos="1843"/>
+          <w:tab w:val="left" w:pos="2268"/>
+        </w:tabs>
+        <w:snapToGrid w:val="0"/>
+        <w:ind w:left="567" w:hanging="567"/>
+        <w:rPr>
+          <w:spacing w:val="20"/>
+          <w:szCs w:val="20"/>
+        </w:rPr>
+      </w:pPr>
+      <w:r/>
+    </w:p>
+    <w:p>
+      <w:pPr>
+        <w:tabs>
+          <w:tab w:val="left" w:pos="567"/>
+          <w:tab w:val="left" w:pos="993"/>
+          <w:tab w:val="left" w:pos="1418"/>
+          <w:tab w:val="left" w:pos="1843"/>
+          <w:tab w:val="left" w:pos="2268"/>
+        </w:tabs>
+        <w:snapToGrid w:val="0"/>
+        <w:ind w:left="567" w:hanging="567"/>
+        <w:rPr>
+          <w:spacing w:val="20"/>
+          <w:szCs w:val="20"/>
+        </w:rPr>
+      </w:pPr>
+      <w:r>
+        <w:tab/>
+        <w:t>A.</w:t>
+        <w:tab/>
+        <w:t>只有 (1)</w:t>
+      </w:r>
+    </w:p>
+    <w:p>
+      <w:pPr>
+        <w:tabs>
+          <w:tab w:val="left" w:pos="567"/>
+          <w:tab w:val="left" w:pos="993"/>
+          <w:tab w:val="left" w:pos="1418"/>
+          <w:tab w:val="left" w:pos="1843"/>
+          <w:tab w:val="left" w:pos="2268"/>
+        </w:tabs>
+        <w:snapToGrid w:val="0"/>
+        <w:ind w:left="567" w:hanging="567"/>
+        <w:rPr>
+          <w:spacing w:val="20"/>
+          <w:szCs w:val="20"/>
+        </w:rPr>
+      </w:pPr>
+      <w:r>
+        <w:tab/>
+        <w:t>B.</w:t>
+        <w:tab/>
+        <w:t>只有 (1) 和 (2)</w:t>
+      </w:r>
+    </w:p>
+    <w:p>
+      <w:pPr>
+        <w:tabs>
+          <w:tab w:val="left" w:pos="567"/>
+          <w:tab w:val="left" w:pos="993"/>
+          <w:tab w:val="left" w:pos="1418"/>
+          <w:tab w:val="left" w:pos="1843"/>
+          <w:tab w:val="left" w:pos="2268"/>
+        </w:tabs>
+        <w:snapToGrid w:val="0"/>
+        <w:ind w:left="567" w:hanging="567"/>
+        <w:rPr>
+          <w:spacing w:val="20"/>
+          <w:szCs w:val="20"/>
+        </w:rPr>
+      </w:pPr>
+      <w:r>
+        <w:tab/>
+        <w:t>C.</w:t>
+        <w:tab/>
+        <w:t>只有 (3)</w:t>
+      </w:r>
+    </w:p>
+    <w:p>
+      <w:pPr>
+        <w:tabs>
+          <w:tab w:val="left" w:pos="567"/>
+          <w:tab w:val="left" w:pos="993"/>
+          <w:tab w:val="left" w:pos="1418"/>
+          <w:tab w:val="left" w:pos="1843"/>
+          <w:tab w:val="left" w:pos="2268"/>
+        </w:tabs>
+        <w:snapToGrid w:val="0"/>
+        <w:ind w:left="567" w:hanging="567"/>
+        <w:rPr>
+          <w:spacing w:val="20"/>
+          <w:szCs w:val="20"/>
+        </w:rPr>
+      </w:pPr>
+      <w:r>
+        <w:tab/>
+        <w:t>D.</w:t>
+        <w:tab/>
+        <w:t>(1)、(2) 和 (3)</w:t>
+      </w:r>
+    </w:p>
+    <w:p>
+      <w:pPr>
+        <w:tabs>
+          <w:tab w:val="left" w:pos="567"/>
+          <w:tab w:val="left" w:pos="993"/>
+          <w:tab w:val="left" w:pos="1418"/>
+          <w:tab w:val="left" w:pos="1843"/>
+          <w:tab w:val="left" w:pos="2268"/>
+        </w:tabs>
+        <w:snapToGrid w:val="0"/>
+        <w:ind w:left="567" w:hanging="567"/>
+        <w:rPr>
+          <w:spacing w:val="20"/>
+          <w:szCs w:val="20"/>
+        </w:rPr>
+      </w:pPr>
+    </w:p>
+    <w:p>
+      <w:pPr>
+        <w:tabs>
+          <w:tab w:val="left" w:pos="567"/>
+          <w:tab w:val="left" w:pos="993"/>
+          <w:tab w:val="left" w:pos="1418"/>
+          <w:tab w:val="left" w:pos="1843"/>
+          <w:tab w:val="left" w:pos="2268"/>
+        </w:tabs>
+        <w:snapToGrid w:val="0"/>
+        <w:ind w:left="567" w:hanging="567"/>
+        <w:rPr>
+          <w:spacing w:val="20"/>
+          <w:szCs w:val="20"/>
+        </w:rPr>
+      </w:pPr>
+    </w:p>
+    <w:p>
+      <w:pPr>
+        <w:pStyle w:val="af3"/>
+        <w:numPr>
+          <w:ilvl w:val="0"/>
+          <w:numId w:val="2"/>
+        </w:numPr>
+        <w:tabs>
+          <w:tab w:val="left" w:pos="567"/>
+          <w:tab w:val="left" w:pos="993"/>
+          <w:tab w:val="left" w:pos="1418"/>
+          <w:tab w:val="left" w:pos="1843"/>
+          <w:tab w:val="left" w:pos="2268"/>
+        </w:tabs>
+        <w:snapToGrid w:val="0"/>
+        <w:ind w:leftChars="0" w:left="567" w:hanging="567"/>
+        <w:rPr>
+          <w:spacing w:val="20"/>
+          <w:szCs w:val="20"/>
+        </w:rPr>
+      </w:pPr>
+      <w:r>
+        <w:t>下列哪句關於「一筆記錄」是正確的？</w:t>
+      </w:r>
+    </w:p>
+    <w:p>
+      <w:pPr>
+        <w:tabs>
+          <w:tab w:val="left" w:pos="567"/>
+          <w:tab w:val="left" w:pos="993"/>
+          <w:tab w:val="left" w:pos="1418"/>
+          <w:tab w:val="left" w:pos="1843"/>
+          <w:tab w:val="left" w:pos="2268"/>
+        </w:tabs>
+        <w:snapToGrid w:val="0"/>
+        <w:rPr>
+          <w:spacing w:val="20"/>
+          <w:szCs w:val="20"/>
+        </w:rPr>
+      </w:pPr>
+      <w:r/>
+    </w:p>
+    <w:p>
+      <w:pPr>
+        <w:tabs>
+          <w:tab w:val="left" w:pos="567"/>
+          <w:tab w:val="left" w:pos="993"/>
+          <w:tab w:val="left" w:pos="1418"/>
+          <w:tab w:val="left" w:pos="1843"/>
+          <w:tab w:val="left" w:pos="2268"/>
+        </w:tabs>
+        <w:snapToGrid w:val="0"/>
+        <w:ind w:left="567" w:hanging="567"/>
+        <w:rPr>
+          <w:spacing w:val="20"/>
+          <w:szCs w:val="20"/>
+        </w:rPr>
+      </w:pPr>
+      <w:r>
+        <w:tab/>
+        <w:t>A.</w:t>
+        <w:tab/>
+        <w:t>由多個欄位值組成的一組相關資料</w:t>
+      </w:r>
+    </w:p>
+    <w:p>
+      <w:pPr>
+        <w:tabs>
+          <w:tab w:val="left" w:pos="567"/>
+          <w:tab w:val="left" w:pos="993"/>
+          <w:tab w:val="left" w:pos="1418"/>
+          <w:tab w:val="left" w:pos="1843"/>
+          <w:tab w:val="left" w:pos="2268"/>
+        </w:tabs>
+        <w:snapToGrid w:val="0"/>
+        <w:ind w:left="567" w:hanging="567"/>
+        <w:rPr>
+          <w:spacing w:val="20"/>
+          <w:szCs w:val="20"/>
+        </w:rPr>
+      </w:pPr>
+      <w:r>
+        <w:tab/>
+        <w:t>B.</w:t>
+        <w:tab/>
+        <w:t>一個欄位內的單一數值</w:t>
+      </w:r>
+    </w:p>
+    <w:p>
+      <w:pPr>
+        <w:tabs>
+          <w:tab w:val="left" w:pos="567"/>
+          <w:tab w:val="left" w:pos="993"/>
+          <w:tab w:val="left" w:pos="1418"/>
+          <w:tab w:val="left" w:pos="1843"/>
+          <w:tab w:val="left" w:pos="2268"/>
+        </w:tabs>
+        <w:snapToGrid w:val="0"/>
+        <w:ind w:left="567" w:hanging="567"/>
+        <w:rPr>
+          <w:spacing w:val="20"/>
+          <w:szCs w:val="20"/>
+        </w:rPr>
+      </w:pPr>
+      <w:r>
+        <w:tab/>
+        <w:t>C.</w:t>
+        <w:tab/>
+        <w:t>CPU 暫存器內容</w:t>
+      </w:r>
+    </w:p>
+    <w:p>
+      <w:pPr>
+        <w:tabs>
+          <w:tab w:val="left" w:pos="567"/>
+          <w:tab w:val="left" w:pos="993"/>
+          <w:tab w:val="left" w:pos="1418"/>
+          <w:tab w:val="left" w:pos="1843"/>
+          <w:tab w:val="left" w:pos="2268"/>
+        </w:tabs>
+        <w:snapToGrid w:val="0"/>
+        <w:ind w:left="567" w:hanging="567"/>
+        <w:rPr>
+          <w:spacing w:val="20"/>
+          <w:szCs w:val="20"/>
+        </w:rPr>
+      </w:pPr>
+      <w:r>
+        <w:tab/>
+        <w:t>D.</w:t>
+        <w:tab/>
+        <w:t>整個資料庫的備份檔</w:t>
+      </w:r>
+    </w:p>
+    <w:p>
+      <w:pPr>
+        <w:tabs>
+          <w:tab w:val="left" w:pos="567"/>
+          <w:tab w:val="left" w:pos="993"/>
+          <w:tab w:val="left" w:pos="1418"/>
+          <w:tab w:val="left" w:pos="1843"/>
+          <w:tab w:val="left" w:pos="2268"/>
+        </w:tabs>
+        <w:snapToGrid w:val="0"/>
+        <w:ind w:left="567" w:hanging="567"/>
+        <w:rPr>
+          <w:spacing w:val="20"/>
+          <w:szCs w:val="20"/>
+        </w:rPr>
+      </w:pPr>
+    </w:p>
+    <w:p>
+      <w:pPr>
+        <w:tabs>
+          <w:tab w:val="left" w:pos="567"/>
+          <w:tab w:val="left" w:pos="993"/>
+          <w:tab w:val="left" w:pos="1418"/>
+          <w:tab w:val="left" w:pos="1843"/>
+          <w:tab w:val="left" w:pos="2268"/>
+        </w:tabs>
+        <w:snapToGrid w:val="0"/>
+        <w:ind w:left="567" w:hanging="567"/>
+        <w:rPr>
+          <w:spacing w:val="20"/>
+          <w:szCs w:val="20"/>
+        </w:rPr>
+      </w:pPr>
+    </w:p>
+    <w:p>
+      <w:pPr>
+        <w:pStyle w:val="af3"/>
+        <w:numPr>
+          <w:ilvl w:val="0"/>
+          <w:numId w:val="2"/>
+        </w:numPr>
+        <w:tabs>
+          <w:tab w:val="left" w:pos="567"/>
+          <w:tab w:val="left" w:pos="993"/>
+          <w:tab w:val="left" w:pos="1418"/>
+          <w:tab w:val="left" w:pos="1843"/>
+          <w:tab w:val="left" w:pos="2268"/>
+        </w:tabs>
+        <w:snapToGrid w:val="0"/>
+        <w:ind w:leftChars="0" w:left="567" w:hanging="567"/>
+        <w:rPr>
+          <w:spacing w:val="20"/>
+          <w:szCs w:val="20"/>
+        </w:rPr>
+      </w:pPr>
+      <w:r>
+        <w:t>傳輸資料時加入校驗位，使每個字節中 1 的個數維持偶數。下列哪句關於此做法是正確的？</w:t>
+      </w:r>
+    </w:p>
+    <w:p>
+      <w:pPr>
+        <w:tabs>
+          <w:tab w:val="left" w:pos="567"/>
+          <w:tab w:val="left" w:pos="993"/>
+          <w:tab w:val="left" w:pos="1418"/>
+          <w:tab w:val="left" w:pos="1843"/>
+          <w:tab w:val="left" w:pos="2268"/>
+        </w:tabs>
+        <w:snapToGrid w:val="0"/>
+        <w:rPr>
+          <w:spacing w:val="20"/>
+          <w:szCs w:val="20"/>
+        </w:rPr>
+      </w:pPr>
+      <w:r/>
+    </w:p>
+    <w:p>
+      <w:pPr>
+        <w:tabs>
+          <w:tab w:val="left" w:pos="567"/>
+          <w:tab w:val="left" w:pos="993"/>
+          <w:tab w:val="left" w:pos="1418"/>
+          <w:tab w:val="left" w:pos="1843"/>
+          <w:tab w:val="left" w:pos="2268"/>
+        </w:tabs>
+        <w:snapToGrid w:val="0"/>
+        <w:ind w:left="567" w:hanging="567"/>
+        <w:rPr>
+          <w:spacing w:val="20"/>
+          <w:szCs w:val="20"/>
+        </w:rPr>
+      </w:pPr>
+      <w:r>
+        <w:tab/>
+        <w:t>A.</w:t>
+        <w:tab/>
+        <w:t>這屬於有效性檢驗</w:t>
+      </w:r>
+    </w:p>
+    <w:p>
+      <w:pPr>
+        <w:tabs>
+          <w:tab w:val="left" w:pos="567"/>
+          <w:tab w:val="left" w:pos="993"/>
+          <w:tab w:val="left" w:pos="1418"/>
+          <w:tab w:val="left" w:pos="1843"/>
+          <w:tab w:val="left" w:pos="2268"/>
+        </w:tabs>
+        <w:snapToGrid w:val="0"/>
+        <w:ind w:left="567" w:hanging="567"/>
+        <w:rPr>
+          <w:spacing w:val="20"/>
+          <w:szCs w:val="20"/>
+        </w:rPr>
+      </w:pPr>
+      <w:r>
+        <w:tab/>
+        <w:t>B.</w:t>
+        <w:tab/>
+        <w:t>這屬於資料壓縮</w:t>
+      </w:r>
+    </w:p>
+    <w:p>
+      <w:pPr>
+        <w:tabs>
+          <w:tab w:val="left" w:pos="567"/>
+          <w:tab w:val="left" w:pos="993"/>
+          <w:tab w:val="left" w:pos="1418"/>
+          <w:tab w:val="left" w:pos="1843"/>
+          <w:tab w:val="left" w:pos="2268"/>
+        </w:tabs>
+        <w:snapToGrid w:val="0"/>
+        <w:ind w:left="567" w:hanging="567"/>
+        <w:rPr>
+          <w:spacing w:val="20"/>
+          <w:szCs w:val="20"/>
+        </w:rPr>
+      </w:pPr>
+      <w:r>
+        <w:tab/>
+        <w:t>C.</w:t>
+        <w:tab/>
+        <w:t>這屬於奇偶檢測</w:t>
+      </w:r>
+    </w:p>
+    <w:p>
+      <w:pPr>
+        <w:tabs>
+          <w:tab w:val="left" w:pos="567"/>
+          <w:tab w:val="left" w:pos="993"/>
+          <w:tab w:val="left" w:pos="1418"/>
+          <w:tab w:val="left" w:pos="1843"/>
+          <w:tab w:val="left" w:pos="2268"/>
+        </w:tabs>
+        <w:snapToGrid w:val="0"/>
+        <w:ind w:left="567" w:hanging="567"/>
+        <w:rPr>
+          <w:spacing w:val="20"/>
+          <w:szCs w:val="20"/>
+        </w:rPr>
+      </w:pPr>
+      <w:r>
+        <w:tab/>
+        <w:t>D.</w:t>
+        <w:tab/>
+        <w:t>這屬於檔案備份</w:t>
+      </w:r>
+    </w:p>
+    <w:p>
+      <w:pPr>
+        <w:tabs>
+          <w:tab w:val="left" w:pos="567"/>
+          <w:tab w:val="left" w:pos="993"/>
+          <w:tab w:val="left" w:pos="1418"/>
+          <w:tab w:val="left" w:pos="1843"/>
+          <w:tab w:val="left" w:pos="2268"/>
+        </w:tabs>
+        <w:snapToGrid w:val="0"/>
+        <w:ind w:left="567" w:hanging="567"/>
+        <w:rPr>
+          <w:spacing w:val="20"/>
+          <w:szCs w:val="20"/>
+        </w:rPr>
+      </w:pPr>
+    </w:p>
+    <w:p>
+      <w:pPr>
+        <w:tabs>
+          <w:tab w:val="left" w:pos="567"/>
+          <w:tab w:val="left" w:pos="993"/>
+          <w:tab w:val="left" w:pos="1418"/>
+          <w:tab w:val="left" w:pos="1843"/>
+          <w:tab w:val="left" w:pos="2268"/>
+        </w:tabs>
+        <w:snapToGrid w:val="0"/>
+        <w:ind w:left="567" w:hanging="567"/>
+        <w:rPr>
+          <w:spacing w:val="20"/>
+          <w:szCs w:val="20"/>
+        </w:rPr>
+      </w:pPr>
+    </w:p>
+    <w:p>
+      <w:pPr>
+        <w:widowControl/>
+        <w:rPr>
+          <w:spacing w:val="20"/>
+          <w:szCs w:val="20"/>
+        </w:rPr>
+      </w:pPr>
+      <w:r>
+        <w:rPr>
+          <w:spacing w:val="20"/>
+          <w:szCs w:val="20"/>
+        </w:rPr>
+        <w:br w:type="page"/>
+      </w:r>
+    </w:p>
+    <w:p>
+      <w:pPr>
+        <w:pStyle w:val="af3"/>
+        <w:numPr>
+          <w:ilvl w:val="0"/>
+          <w:numId w:val="2"/>
+        </w:numPr>
+        <w:tabs>
+          <w:tab w:val="left" w:pos="567"/>
+          <w:tab w:val="left" w:pos="993"/>
+          <w:tab w:val="left" w:pos="1418"/>
+          <w:tab w:val="left" w:pos="1843"/>
+          <w:tab w:val="left" w:pos="2268"/>
+        </w:tabs>
+        <w:snapToGrid w:val="0"/>
+        <w:ind w:leftChars="0" w:left="567" w:hanging="567"/>
+        <w:rPr>
+          <w:spacing w:val="20"/>
+          <w:szCs w:val="20"/>
+        </w:rPr>
+      </w:pPr>
+      <w:r>
+        <w:t>下列哪項處理方式最符合「累積一整批訂單後在深夜統一結算」？</w:t>
+      </w:r>
+    </w:p>
+    <w:p>
+      <w:pPr>
+        <w:tabs>
+          <w:tab w:val="left" w:pos="567"/>
+          <w:tab w:val="left" w:pos="993"/>
+          <w:tab w:val="left" w:pos="1418"/>
+          <w:tab w:val="left" w:pos="1843"/>
+          <w:tab w:val="left" w:pos="2268"/>
+        </w:tabs>
+        <w:snapToGrid w:val="0"/>
+        <w:rPr>
+          <w:spacing w:val="20"/>
+          <w:szCs w:val="20"/>
+        </w:rPr>
+      </w:pPr>
+      <w:r/>
+    </w:p>
+    <w:p>
+      <w:pPr>
+        <w:tabs>
+          <w:tab w:val="left" w:pos="567"/>
+          <w:tab w:val="left" w:pos="993"/>
+          <w:tab w:val="left" w:pos="1418"/>
+          <w:tab w:val="left" w:pos="1843"/>
+          <w:tab w:val="left" w:pos="2268"/>
+        </w:tabs>
+        <w:snapToGrid w:val="0"/>
+        <w:ind w:left="567" w:hanging="567"/>
+        <w:rPr>
+          <w:spacing w:val="20"/>
+          <w:szCs w:val="20"/>
+        </w:rPr>
+      </w:pPr>
+      <w:r>
+        <w:tab/>
+        <w:t>A.</w:t>
+        <w:tab/>
+        <w:t>即時處理</w:t>
+      </w:r>
+    </w:p>
+    <w:p>
+      <w:pPr>
+        <w:tabs>
+          <w:tab w:val="left" w:pos="567"/>
+          <w:tab w:val="left" w:pos="993"/>
+          <w:tab w:val="left" w:pos="1418"/>
+          <w:tab w:val="left" w:pos="1843"/>
+          <w:tab w:val="left" w:pos="2268"/>
+        </w:tabs>
+        <w:snapToGrid w:val="0"/>
+        <w:ind w:left="567" w:hanging="567"/>
+        <w:rPr>
+          <w:spacing w:val="20"/>
+          <w:szCs w:val="20"/>
+        </w:rPr>
+      </w:pPr>
+      <w:r>
+        <w:tab/>
+        <w:t>B.</w:t>
+        <w:tab/>
+        <w:t>互動式處理</w:t>
+      </w:r>
+    </w:p>
+    <w:p>
+      <w:pPr>
+        <w:tabs>
+          <w:tab w:val="left" w:pos="567"/>
+          <w:tab w:val="left" w:pos="993"/>
+          <w:tab w:val="left" w:pos="1418"/>
+          <w:tab w:val="left" w:pos="1843"/>
+          <w:tab w:val="left" w:pos="2268"/>
+        </w:tabs>
+        <w:snapToGrid w:val="0"/>
+        <w:ind w:left="567" w:hanging="567"/>
+        <w:rPr>
+          <w:spacing w:val="20"/>
+          <w:szCs w:val="20"/>
+        </w:rPr>
+      </w:pPr>
+      <w:r>
+        <w:tab/>
+        <w:t>C.</w:t>
+        <w:tab/>
+        <w:t>感應器即時回饋</w:t>
+      </w:r>
+    </w:p>
+    <w:p>
+      <w:pPr>
+        <w:tabs>
+          <w:tab w:val="left" w:pos="567"/>
+          <w:tab w:val="left" w:pos="993"/>
+          <w:tab w:val="left" w:pos="1418"/>
+          <w:tab w:val="left" w:pos="1843"/>
+          <w:tab w:val="left" w:pos="2268"/>
+        </w:tabs>
+        <w:snapToGrid w:val="0"/>
+        <w:ind w:left="567" w:hanging="567"/>
+        <w:rPr>
+          <w:spacing w:val="20"/>
+          <w:szCs w:val="20"/>
+        </w:rPr>
+      </w:pPr>
+      <w:r>
+        <w:tab/>
+        <w:t>D.</w:t>
+        <w:tab/>
+        <w:t>批次處理</w:t>
+      </w:r>
+    </w:p>
+    <w:p>
+      <w:pPr>
+        <w:tabs>
+          <w:tab w:val="left" w:pos="567"/>
+          <w:tab w:val="left" w:pos="993"/>
+          <w:tab w:val="left" w:pos="1418"/>
+          <w:tab w:val="left" w:pos="1843"/>
+          <w:tab w:val="left" w:pos="2268"/>
+        </w:tabs>
+        <w:snapToGrid w:val="0"/>
+        <w:ind w:left="567" w:hanging="567"/>
+        <w:rPr>
+          <w:spacing w:val="20"/>
+          <w:szCs w:val="20"/>
+        </w:rPr>
+      </w:pPr>
+    </w:p>
+    <w:p>
+      <w:pPr>
+        <w:tabs>
+          <w:tab w:val="left" w:pos="567"/>
+          <w:tab w:val="left" w:pos="993"/>
+          <w:tab w:val="left" w:pos="1418"/>
+          <w:tab w:val="left" w:pos="1843"/>
+          <w:tab w:val="left" w:pos="2268"/>
+        </w:tabs>
+        <w:snapToGrid w:val="0"/>
+        <w:ind w:left="567" w:hanging="567"/>
+        <w:rPr>
+          <w:spacing w:val="20"/>
+          <w:szCs w:val="20"/>
+        </w:rPr>
+      </w:pPr>
+    </w:p>
+    <w:p>
+      <w:pPr>
+        <w:pStyle w:val="af3"/>
+        <w:numPr>
+          <w:ilvl w:val="0"/>
+          <w:numId w:val="2"/>
+        </w:numPr>
+        <w:tabs>
+          <w:tab w:val="left" w:pos="567"/>
+          <w:tab w:val="left" w:pos="993"/>
+          <w:tab w:val="left" w:pos="1418"/>
+          <w:tab w:val="left" w:pos="1843"/>
+          <w:tab w:val="left" w:pos="2268"/>
+        </w:tabs>
+        <w:snapToGrid w:val="0"/>
+        <w:ind w:leftChars="0" w:left="567" w:hanging="567"/>
+        <w:rPr>
+          <w:spacing w:val="20"/>
+          <w:szCs w:val="20"/>
+        </w:rPr>
+      </w:pPr>
+      <w:r>
+        <w:t>比較直接存取與順序存取檔案，下列哪句是正確的？</w:t>
+      </w:r>
+    </w:p>
+    <w:p>
+      <w:pPr>
+        <w:tabs>
+          <w:tab w:val="left" w:pos="567"/>
+          <w:tab w:val="left" w:pos="993"/>
+          <w:tab w:val="left" w:pos="1418"/>
+          <w:tab w:val="left" w:pos="1843"/>
+          <w:tab w:val="left" w:pos="2268"/>
+        </w:tabs>
+        <w:snapToGrid w:val="0"/>
+        <w:rPr>
+          <w:spacing w:val="20"/>
+          <w:szCs w:val="20"/>
+        </w:rPr>
+      </w:pPr>
+      <w:r/>
+    </w:p>
+    <w:p>
+      <w:pPr>
+        <w:tabs>
+          <w:tab w:val="left" w:pos="567"/>
+          <w:tab w:val="left" w:pos="993"/>
+          <w:tab w:val="left" w:pos="1418"/>
+          <w:tab w:val="left" w:pos="1843"/>
+          <w:tab w:val="left" w:pos="2268"/>
+        </w:tabs>
+        <w:snapToGrid w:val="0"/>
+        <w:ind w:left="567" w:hanging="567"/>
+        <w:rPr>
+          <w:spacing w:val="20"/>
+          <w:szCs w:val="20"/>
+        </w:rPr>
+      </w:pPr>
+      <w:r>
+        <w:tab/>
+        <w:t>A.</w:t>
+        <w:tab/>
+        <w:t>順序存取必須從頭開始逐一讀取直至目標記錄</w:t>
+      </w:r>
+    </w:p>
+    <w:p>
+      <w:pPr>
+        <w:tabs>
+          <w:tab w:val="left" w:pos="567"/>
+          <w:tab w:val="left" w:pos="993"/>
+          <w:tab w:val="left" w:pos="1418"/>
+          <w:tab w:val="left" w:pos="1843"/>
+          <w:tab w:val="left" w:pos="2268"/>
+        </w:tabs>
+        <w:snapToGrid w:val="0"/>
+        <w:ind w:left="567" w:hanging="567"/>
+        <w:rPr>
+          <w:spacing w:val="20"/>
+          <w:szCs w:val="20"/>
+        </w:rPr>
+      </w:pPr>
+      <w:r>
+        <w:tab/>
+        <w:t>B.</w:t>
+        <w:tab/>
+        <w:t>兩者均不能讀取文字檔</w:t>
+      </w:r>
+    </w:p>
+    <w:p>
+      <w:pPr>
+        <w:tabs>
+          <w:tab w:val="left" w:pos="567"/>
+          <w:tab w:val="left" w:pos="993"/>
+          <w:tab w:val="left" w:pos="1418"/>
+          <w:tab w:val="left" w:pos="1843"/>
+          <w:tab w:val="left" w:pos="2268"/>
+        </w:tabs>
+        <w:snapToGrid w:val="0"/>
+        <w:ind w:left="567" w:hanging="567"/>
+        <w:rPr>
+          <w:spacing w:val="20"/>
+          <w:szCs w:val="20"/>
+        </w:rPr>
+      </w:pPr>
+      <w:r>
+        <w:tab/>
+        <w:t>C.</w:t>
+        <w:tab/>
+        <w:t>直接存取可在已知索引下較快定位特定記錄</w:t>
+      </w:r>
+    </w:p>
+    <w:p>
+      <w:pPr>
+        <w:tabs>
+          <w:tab w:val="left" w:pos="567"/>
+          <w:tab w:val="left" w:pos="993"/>
+          <w:tab w:val="left" w:pos="1418"/>
+          <w:tab w:val="left" w:pos="1843"/>
+          <w:tab w:val="left" w:pos="2268"/>
+        </w:tabs>
+        <w:snapToGrid w:val="0"/>
+        <w:ind w:left="567" w:hanging="567"/>
+        <w:rPr>
+          <w:spacing w:val="20"/>
+          <w:szCs w:val="20"/>
+        </w:rPr>
+      </w:pPr>
+      <w:r>
+        <w:tab/>
+        <w:t>D.</w:t>
+        <w:tab/>
+        <w:t>直接存取只能用於堆疊結構</w:t>
+      </w:r>
+    </w:p>
+    <w:p>
+      <w:pPr>
+        <w:tabs>
+          <w:tab w:val="left" w:pos="567"/>
+          <w:tab w:val="left" w:pos="993"/>
+          <w:tab w:val="left" w:pos="1418"/>
+          <w:tab w:val="left" w:pos="1843"/>
+          <w:tab w:val="left" w:pos="2268"/>
+        </w:tabs>
+        <w:snapToGrid w:val="0"/>
+        <w:ind w:left="567" w:hanging="567"/>
+        <w:rPr>
+          <w:spacing w:val="20"/>
+          <w:szCs w:val="20"/>
+        </w:rPr>
+      </w:pPr>
+    </w:p>
+    <w:p>
+      <w:pPr>
+        <w:tabs>
+          <w:tab w:val="left" w:pos="567"/>
+          <w:tab w:val="left" w:pos="993"/>
+          <w:tab w:val="left" w:pos="1418"/>
+          <w:tab w:val="left" w:pos="1843"/>
+          <w:tab w:val="left" w:pos="2268"/>
+        </w:tabs>
+        <w:snapToGrid w:val="0"/>
+        <w:ind w:left="567" w:hanging="567"/>
+        <w:rPr>
+          <w:spacing w:val="20"/>
+          <w:szCs w:val="20"/>
+        </w:rPr>
+      </w:pPr>
+    </w:p>
+    <w:p>
+      <w:pPr>
+        <w:pStyle w:val="af3"/>
+        <w:numPr>
+          <w:ilvl w:val="0"/>
+          <w:numId w:val="2"/>
+        </w:numPr>
+        <w:tabs>
+          <w:tab w:val="left" w:pos="567"/>
+          <w:tab w:val="left" w:pos="993"/>
+          <w:tab w:val="left" w:pos="1418"/>
+          <w:tab w:val="left" w:pos="1843"/>
+          <w:tab w:val="left" w:pos="2268"/>
+        </w:tabs>
+        <w:snapToGrid w:val="0"/>
+        <w:ind w:leftChars="0" w:left="567" w:hanging="567"/>
+        <w:rPr>
+          <w:spacing w:val="20"/>
+          <w:szCs w:val="20"/>
+        </w:rPr>
+      </w:pPr>
+      <w:r>
+        <w:t>下列哪項（些）關於向量圖與點陣圖的句子是正確的？</w:t>
+      </w:r>
+    </w:p>
+    <w:p>
+      <w:pPr>
+        <w:tabs>
+          <w:tab w:val="left" w:pos="567"/>
+          <w:tab w:val="left" w:pos="993"/>
+          <w:tab w:val="left" w:pos="1418"/>
+          <w:tab w:val="left" w:pos="1843"/>
+          <w:tab w:val="left" w:pos="2268"/>
+        </w:tabs>
+        <w:snapToGrid w:val="0"/>
+        <w:rPr>
+          <w:spacing w:val="20"/>
+          <w:szCs w:val="20"/>
+        </w:rPr>
+      </w:pPr>
+      <w:r/>
+    </w:p>
+    <w:p>
+      <w:pPr>
+        <w:tabs>
+          <w:tab w:val="left" w:pos="567"/>
+          <w:tab w:val="left" w:pos="993"/>
+          <w:tab w:val="left" w:pos="1418"/>
+          <w:tab w:val="left" w:pos="1843"/>
+          <w:tab w:val="left" w:pos="2268"/>
+        </w:tabs>
+        <w:snapToGrid w:val="0"/>
+        <w:ind w:left="567" w:hanging="567"/>
+        <w:rPr>
+          <w:spacing w:val="20"/>
+          <w:szCs w:val="20"/>
+        </w:rPr>
+      </w:pPr>
+      <w:r>
+        <w:tab/>
+        <w:tab/>
+        <w:t>(1)</w:t>
+        <w:tab/>
+        <w:t>向量圖以數學描述圖形，放大較不易失真</w:t>
+      </w:r>
+    </w:p>
+    <w:p>
+      <w:pPr>
+        <w:tabs>
+          <w:tab w:val="left" w:pos="567"/>
+          <w:tab w:val="left" w:pos="993"/>
+          <w:tab w:val="left" w:pos="1418"/>
+          <w:tab w:val="left" w:pos="1843"/>
+          <w:tab w:val="left" w:pos="2268"/>
+        </w:tabs>
+        <w:snapToGrid w:val="0"/>
+        <w:ind w:left="567" w:hanging="567"/>
+        <w:rPr>
+          <w:spacing w:val="20"/>
+          <w:szCs w:val="20"/>
+        </w:rPr>
+      </w:pPr>
+      <w:r>
+        <w:tab/>
+        <w:tab/>
+        <w:t>(2)</w:t>
+        <w:tab/>
+        <w:t>點陣圖由像素組成</w:t>
+      </w:r>
+    </w:p>
+    <w:p>
+      <w:pPr>
+        <w:tabs>
+          <w:tab w:val="left" w:pos="567"/>
+          <w:tab w:val="left" w:pos="993"/>
+          <w:tab w:val="left" w:pos="1418"/>
+          <w:tab w:val="left" w:pos="1843"/>
+          <w:tab w:val="left" w:pos="2268"/>
+        </w:tabs>
+        <w:snapToGrid w:val="0"/>
+        <w:ind w:left="567" w:hanging="567"/>
+        <w:rPr>
+          <w:spacing w:val="20"/>
+          <w:szCs w:val="20"/>
+        </w:rPr>
+      </w:pPr>
+      <w:r>
+        <w:tab/>
+        <w:tab/>
+        <w:t>(3)</w:t>
+        <w:tab/>
+        <w:t>相片掃描結果通常以點陣圖儲存</w:t>
+      </w:r>
+    </w:p>
+    <w:p>
+      <w:pPr>
+        <w:tabs>
+          <w:tab w:val="left" w:pos="567"/>
+          <w:tab w:val="left" w:pos="993"/>
+          <w:tab w:val="left" w:pos="1418"/>
+          <w:tab w:val="left" w:pos="1843"/>
+          <w:tab w:val="left" w:pos="2268"/>
+        </w:tabs>
+        <w:snapToGrid w:val="0"/>
+        <w:ind w:left="567" w:hanging="567"/>
+        <w:rPr>
+          <w:spacing w:val="20"/>
+          <w:szCs w:val="20"/>
+        </w:rPr>
+      </w:pPr>
+      <w:r/>
+    </w:p>
+    <w:p>
+      <w:pPr>
+        <w:tabs>
+          <w:tab w:val="left" w:pos="567"/>
+          <w:tab w:val="left" w:pos="993"/>
+          <w:tab w:val="left" w:pos="1418"/>
+          <w:tab w:val="left" w:pos="1843"/>
+          <w:tab w:val="left" w:pos="2268"/>
+        </w:tabs>
+        <w:snapToGrid w:val="0"/>
+        <w:ind w:left="567" w:hanging="567"/>
+        <w:rPr>
+          <w:spacing w:val="20"/>
+          <w:szCs w:val="20"/>
+        </w:rPr>
+      </w:pPr>
+      <w:r>
+        <w:tab/>
+        <w:t>A.</w:t>
+        <w:tab/>
+        <w:t>只有 (1)</w:t>
+      </w:r>
+    </w:p>
+    <w:p>
+      <w:pPr>
+        <w:tabs>
+          <w:tab w:val="left" w:pos="567"/>
+          <w:tab w:val="left" w:pos="993"/>
+          <w:tab w:val="left" w:pos="1418"/>
+          <w:tab w:val="left" w:pos="1843"/>
+          <w:tab w:val="left" w:pos="2268"/>
+        </w:tabs>
+        <w:snapToGrid w:val="0"/>
+        <w:ind w:left="567" w:hanging="567"/>
+        <w:rPr>
+          <w:spacing w:val="20"/>
+          <w:szCs w:val="20"/>
+        </w:rPr>
+      </w:pPr>
+      <w:r>
+        <w:tab/>
+        <w:t>B.</w:t>
+        <w:tab/>
+        <w:t>只有 (1) 和 (2)</w:t>
+      </w:r>
+    </w:p>
+    <w:p>
+      <w:pPr>
+        <w:tabs>
+          <w:tab w:val="left" w:pos="567"/>
+          <w:tab w:val="left" w:pos="993"/>
+          <w:tab w:val="left" w:pos="1418"/>
+          <w:tab w:val="left" w:pos="1843"/>
+          <w:tab w:val="left" w:pos="2268"/>
+        </w:tabs>
+        <w:snapToGrid w:val="0"/>
+        <w:ind w:left="567" w:hanging="567"/>
+        <w:rPr>
+          <w:spacing w:val="20"/>
+          <w:szCs w:val="20"/>
+        </w:rPr>
+      </w:pPr>
+      <w:r>
+        <w:tab/>
+        <w:t>C.</w:t>
+        <w:tab/>
+        <w:t>只有 (3)</w:t>
+      </w:r>
+    </w:p>
+    <w:p>
+      <w:pPr>
+        <w:tabs>
+          <w:tab w:val="left" w:pos="567"/>
+          <w:tab w:val="left" w:pos="993"/>
+          <w:tab w:val="left" w:pos="1418"/>
+          <w:tab w:val="left" w:pos="1843"/>
+          <w:tab w:val="left" w:pos="2268"/>
+        </w:tabs>
+        <w:snapToGrid w:val="0"/>
+        <w:ind w:left="567" w:hanging="567"/>
+        <w:rPr>
+          <w:spacing w:val="20"/>
+          <w:szCs w:val="20"/>
+        </w:rPr>
+      </w:pPr>
+      <w:r>
+        <w:tab/>
+        <w:t>D.</w:t>
+        <w:tab/>
+        <w:t>(1)、(2) 和 (3)</w:t>
+      </w:r>
+    </w:p>
+    <w:p>
+      <w:pPr>
+        <w:tabs>
+          <w:tab w:val="left" w:pos="567"/>
+          <w:tab w:val="left" w:pos="993"/>
+          <w:tab w:val="left" w:pos="1418"/>
+          <w:tab w:val="left" w:pos="1843"/>
+          <w:tab w:val="left" w:pos="2268"/>
+        </w:tabs>
+        <w:snapToGrid w:val="0"/>
+        <w:ind w:left="567" w:hanging="567"/>
+        <w:rPr>
+          <w:spacing w:val="20"/>
+          <w:szCs w:val="20"/>
+        </w:rPr>
+      </w:pPr>
+    </w:p>
+    <w:p>
+      <w:pPr>
+        <w:widowControl/>
+        <w:rPr>
+          <w:spacing w:val="20"/>
+          <w:szCs w:val="20"/>
+        </w:rPr>
+      </w:pPr>
+    </w:p>
+    <w:p>
+      <w:pPr>
+        <w:pStyle w:val="af3"/>
+        <w:numPr>
+          <w:ilvl w:val="0"/>
+          <w:numId w:val="2"/>
+        </w:numPr>
+        <w:tabs>
+          <w:tab w:val="left" w:pos="567"/>
+          <w:tab w:val="left" w:pos="993"/>
+          <w:tab w:val="left" w:pos="1418"/>
+          <w:tab w:val="left" w:pos="1843"/>
+          <w:tab w:val="left" w:pos="2268"/>
+        </w:tabs>
+        <w:snapToGrid w:val="0"/>
+        <w:ind w:leftChars="0" w:left="567" w:hanging="567"/>
+        <w:rPr>
+          <w:spacing w:val="20"/>
+          <w:szCs w:val="20"/>
+        </w:rPr>
+      </w:pPr>
+      <w:r>
+        <w:t>下列哪項（些）關於作業系統（OS）主要功能的句子是正確的？</w:t>
+      </w:r>
+    </w:p>
+    <w:p>
+      <w:pPr>
+        <w:tabs>
+          <w:tab w:val="left" w:pos="567"/>
+          <w:tab w:val="left" w:pos="993"/>
+          <w:tab w:val="left" w:pos="1418"/>
+          <w:tab w:val="left" w:pos="1843"/>
+          <w:tab w:val="left" w:pos="2268"/>
+        </w:tabs>
+        <w:snapToGrid w:val="0"/>
+        <w:rPr>
+          <w:spacing w:val="20"/>
+          <w:szCs w:val="20"/>
+        </w:rPr>
+      </w:pPr>
+      <w:r/>
+    </w:p>
+    <w:p>
+      <w:pPr>
+        <w:tabs>
+          <w:tab w:val="left" w:pos="567"/>
+          <w:tab w:val="left" w:pos="993"/>
+          <w:tab w:val="left" w:pos="1418"/>
+          <w:tab w:val="left" w:pos="1843"/>
+          <w:tab w:val="left" w:pos="2268"/>
+        </w:tabs>
+        <w:snapToGrid w:val="0"/>
+        <w:ind w:left="567" w:hanging="567"/>
+        <w:rPr>
+          <w:spacing w:val="20"/>
+          <w:szCs w:val="20"/>
+        </w:rPr>
+      </w:pPr>
+      <w:r>
+        <w:tab/>
+        <w:tab/>
+        <w:t>(1)</w:t>
+        <w:tab/>
+        <w:t>管理記憶體與處理器資源</w:t>
+      </w:r>
+    </w:p>
+    <w:p>
+      <w:pPr>
+        <w:tabs>
+          <w:tab w:val="left" w:pos="567"/>
+          <w:tab w:val="left" w:pos="993"/>
+          <w:tab w:val="left" w:pos="1418"/>
+          <w:tab w:val="left" w:pos="1843"/>
+          <w:tab w:val="left" w:pos="2268"/>
+        </w:tabs>
+        <w:snapToGrid w:val="0"/>
+        <w:ind w:left="567" w:hanging="567"/>
+        <w:rPr>
+          <w:spacing w:val="20"/>
+          <w:szCs w:val="20"/>
+        </w:rPr>
+      </w:pPr>
+      <w:r>
+        <w:tab/>
+        <w:tab/>
+        <w:t>(2)</w:t>
+        <w:tab/>
+        <w:t>提供使用者介面</w:t>
+      </w:r>
+    </w:p>
+    <w:p>
+      <w:pPr>
+        <w:tabs>
+          <w:tab w:val="left" w:pos="567"/>
+          <w:tab w:val="left" w:pos="993"/>
+          <w:tab w:val="left" w:pos="1418"/>
+          <w:tab w:val="left" w:pos="1843"/>
+          <w:tab w:val="left" w:pos="2268"/>
+        </w:tabs>
+        <w:snapToGrid w:val="0"/>
+        <w:ind w:left="567" w:hanging="567"/>
+        <w:rPr>
+          <w:spacing w:val="20"/>
+          <w:szCs w:val="20"/>
+        </w:rPr>
+      </w:pPr>
+      <w:r>
+        <w:tab/>
+        <w:tab/>
+        <w:t>(3)</w:t>
+        <w:tab/>
+        <w:t>必定只能同時執行一個程式</w:t>
+      </w:r>
+    </w:p>
+    <w:p>
+      <w:pPr>
+        <w:tabs>
+          <w:tab w:val="left" w:pos="567"/>
+          <w:tab w:val="left" w:pos="993"/>
+          <w:tab w:val="left" w:pos="1418"/>
+          <w:tab w:val="left" w:pos="1843"/>
+          <w:tab w:val="left" w:pos="2268"/>
+        </w:tabs>
+        <w:snapToGrid w:val="0"/>
+        <w:rPr>
+          <w:spacing w:val="20"/>
+          <w:szCs w:val="20"/>
+        </w:rPr>
+      </w:pPr>
+      <w:r/>
+    </w:p>
+    <w:p>
+      <w:pPr>
+        <w:tabs>
+          <w:tab w:val="left" w:pos="567"/>
+          <w:tab w:val="left" w:pos="993"/>
+          <w:tab w:val="left" w:pos="1418"/>
+          <w:tab w:val="left" w:pos="1843"/>
+          <w:tab w:val="left" w:pos="2268"/>
+        </w:tabs>
+        <w:snapToGrid w:val="0"/>
+        <w:ind w:left="567" w:hanging="567"/>
+        <w:rPr>
+          <w:spacing w:val="20"/>
+          <w:szCs w:val="20"/>
+        </w:rPr>
+      </w:pPr>
+      <w:r>
+        <w:tab/>
+        <w:t>A.</w:t>
+        <w:tab/>
+        <w:t>只有 (1)</w:t>
+      </w:r>
+    </w:p>
+    <w:p>
+      <w:pPr>
+        <w:tabs>
+          <w:tab w:val="left" w:pos="567"/>
+          <w:tab w:val="left" w:pos="993"/>
+          <w:tab w:val="left" w:pos="1418"/>
+          <w:tab w:val="left" w:pos="1843"/>
+          <w:tab w:val="left" w:pos="2268"/>
+        </w:tabs>
+        <w:snapToGrid w:val="0"/>
+        <w:ind w:left="567" w:hanging="567"/>
+        <w:rPr>
+          <w:spacing w:val="20"/>
+          <w:szCs w:val="20"/>
+        </w:rPr>
+      </w:pPr>
+      <w:r>
+        <w:tab/>
+        <w:t>B.</w:t>
+        <w:tab/>
+        <w:t>只有 (1) 和 (2)</w:t>
+      </w:r>
+    </w:p>
+    <w:p>
+      <w:pPr>
+        <w:tabs>
+          <w:tab w:val="left" w:pos="567"/>
+          <w:tab w:val="left" w:pos="993"/>
+          <w:tab w:val="left" w:pos="1418"/>
+          <w:tab w:val="left" w:pos="1843"/>
+          <w:tab w:val="left" w:pos="2268"/>
+        </w:tabs>
+        <w:snapToGrid w:val="0"/>
+        <w:ind w:left="567" w:hanging="567"/>
+        <w:rPr>
+          <w:spacing w:val="20"/>
+          <w:szCs w:val="20"/>
+        </w:rPr>
+      </w:pPr>
+      <w:r>
+        <w:tab/>
+        <w:t>C.</w:t>
+        <w:tab/>
+        <w:t>(1) 和 (2) 均正確</w:t>
       </w:r>
     </w:p>
     <w:p>
@@ -5057,7 +6255,7 @@
         </w:rPr>
       </w:pPr>
       <w:r>
-        <w:t>下列哪一項最能描述免費軟件（Freeware）？</w:t>
+        <w:t>細看以下流程：學校以問卷收集學生意見，再人手輸入試算表分析。</w:t>
       </w:r>
     </w:p>
     <w:p>
@@ -5076,1203 +6274,6 @@
         </w:rPr>
       </w:pPr>
       <w:r/>
-    </w:p>
-    <w:p>
-      <w:pPr>
-        <w:tabs>
-          <w:tab w:val="left" w:pos="567"/>
-          <w:tab w:val="left" w:pos="993"/>
-          <w:tab w:val="left" w:pos="1418"/>
-          <w:tab w:val="left" w:pos="1843"/>
-          <w:tab w:val="left" w:pos="2268"/>
-        </w:tabs>
-        <w:snapToGrid w:val="0"/>
-        <w:ind w:left="567" w:hanging="567"/>
-        <w:rPr>
-          <w:spacing w:val="20"/>
-          <w:szCs w:val="20"/>
-        </w:rPr>
-      </w:pPr>
-      <w:r>
-        <w:tab/>
-        <w:t>A.</w:t>
-        <w:tab/>
-        <w:t>只能試用 30 天</w:t>
-      </w:r>
-    </w:p>
-    <w:p>
-      <w:pPr>
-        <w:tabs>
-          <w:tab w:val="left" w:pos="567"/>
-          <w:tab w:val="left" w:pos="993"/>
-          <w:tab w:val="left" w:pos="1418"/>
-          <w:tab w:val="left" w:pos="1843"/>
-          <w:tab w:val="left" w:pos="2268"/>
-        </w:tabs>
-        <w:snapToGrid w:val="0"/>
-        <w:ind w:left="567" w:hanging="567"/>
-        <w:rPr>
-          <w:spacing w:val="20"/>
-          <w:szCs w:val="20"/>
-        </w:rPr>
-      </w:pPr>
-      <w:r>
-        <w:tab/>
-        <w:t>B.</w:t>
-        <w:tab/>
-        <w:t>可免費使用但未必提供原始碼</w:t>
-      </w:r>
-    </w:p>
-    <w:p>
-      <w:pPr>
-        <w:tabs>
-          <w:tab w:val="left" w:pos="567"/>
-          <w:tab w:val="left" w:pos="993"/>
-          <w:tab w:val="left" w:pos="1418"/>
-          <w:tab w:val="left" w:pos="1843"/>
-          <w:tab w:val="left" w:pos="2268"/>
-        </w:tabs>
-        <w:snapToGrid w:val="0"/>
-        <w:ind w:left="567" w:hanging="567"/>
-        <w:rPr>
-          <w:spacing w:val="20"/>
-          <w:szCs w:val="20"/>
-        </w:rPr>
-      </w:pPr>
-      <w:r>
-        <w:tab/>
-        <w:t>C.</w:t>
-        <w:tab/>
-        <w:t>必須付費取得授權金鑰</w:t>
-      </w:r>
-    </w:p>
-    <w:p>
-      <w:pPr>
-        <w:tabs>
-          <w:tab w:val="left" w:pos="567"/>
-          <w:tab w:val="left" w:pos="993"/>
-          <w:tab w:val="left" w:pos="1418"/>
-          <w:tab w:val="left" w:pos="1843"/>
-          <w:tab w:val="left" w:pos="2268"/>
-        </w:tabs>
-        <w:snapToGrid w:val="0"/>
-        <w:ind w:left="567" w:hanging="567"/>
-        <w:rPr>
-          <w:spacing w:val="20"/>
-          <w:szCs w:val="20"/>
-        </w:rPr>
-      </w:pPr>
-      <w:r>
-        <w:tab/>
-        <w:t>D.</w:t>
-        <w:tab/>
-        <w:t>原始碼必定公開且可自由修改</w:t>
-      </w:r>
-    </w:p>
-    <w:p>
-      <w:pPr>
-        <w:tabs>
-          <w:tab w:val="left" w:pos="567"/>
-          <w:tab w:val="left" w:pos="993"/>
-          <w:tab w:val="left" w:pos="1418"/>
-          <w:tab w:val="left" w:pos="1843"/>
-          <w:tab w:val="left" w:pos="2268"/>
-        </w:tabs>
-        <w:snapToGrid w:val="0"/>
-        <w:ind w:left="567" w:hanging="567"/>
-        <w:rPr>
-          <w:spacing w:val="20"/>
-          <w:szCs w:val="20"/>
-        </w:rPr>
-      </w:pPr>
-    </w:p>
-    <w:p>
-      <w:pPr>
-        <w:tabs>
-          <w:tab w:val="left" w:pos="567"/>
-          <w:tab w:val="left" w:pos="993"/>
-          <w:tab w:val="left" w:pos="1418"/>
-          <w:tab w:val="left" w:pos="1843"/>
-          <w:tab w:val="left" w:pos="2268"/>
-        </w:tabs>
-        <w:snapToGrid w:val="0"/>
-        <w:ind w:left="567" w:hanging="567"/>
-        <w:rPr>
-          <w:spacing w:val="20"/>
-          <w:szCs w:val="20"/>
-        </w:rPr>
-      </w:pPr>
-    </w:p>
-    <w:p>
-      <w:pPr>
-        <w:pStyle w:val="af3"/>
-        <w:numPr>
-          <w:ilvl w:val="0"/>
-          <w:numId w:val="2"/>
-        </w:numPr>
-        <w:tabs>
-          <w:tab w:val="left" w:pos="567"/>
-          <w:tab w:val="left" w:pos="993"/>
-          <w:tab w:val="left" w:pos="1418"/>
-          <w:tab w:val="left" w:pos="1843"/>
-          <w:tab w:val="left" w:pos="2268"/>
-        </w:tabs>
-        <w:snapToGrid w:val="0"/>
-        <w:ind w:leftChars="0" w:left="567" w:hanging="567"/>
-        <w:rPr>
-          <w:spacing w:val="20"/>
-          <w:szCs w:val="20"/>
-        </w:rPr>
-      </w:pPr>
-      <w:r>
-        <w:t>「數碼足跡（Digital Footprint）」最主要是指？</w:t>
-      </w:r>
-    </w:p>
-    <w:p>
-      <w:pPr>
-        <w:tabs>
-          <w:tab w:val="left" w:pos="567"/>
-          <w:tab w:val="left" w:pos="993"/>
-          <w:tab w:val="left" w:pos="1418"/>
-          <w:tab w:val="left" w:pos="1843"/>
-          <w:tab w:val="left" w:pos="2268"/>
-        </w:tabs>
-        <w:snapToGrid w:val="0"/>
-        <w:rPr>
-          <w:spacing w:val="20"/>
-          <w:szCs w:val="20"/>
-        </w:rPr>
-      </w:pPr>
-      <w:r/>
-    </w:p>
-    <w:p>
-      <w:pPr>
-        <w:tabs>
-          <w:tab w:val="left" w:pos="567"/>
-          <w:tab w:val="left" w:pos="993"/>
-          <w:tab w:val="left" w:pos="1418"/>
-          <w:tab w:val="left" w:pos="1843"/>
-          <w:tab w:val="left" w:pos="2268"/>
-        </w:tabs>
-        <w:snapToGrid w:val="0"/>
-        <w:ind w:left="567" w:hanging="567"/>
-        <w:rPr>
-          <w:spacing w:val="20"/>
-          <w:szCs w:val="20"/>
-        </w:rPr>
-      </w:pPr>
-      <w:r>
-        <w:tab/>
-        <w:t>A.</w:t>
-        <w:tab/>
-        <w:t>使用者在數碼服務中留下的可追溯資料與紀錄</w:t>
-      </w:r>
-    </w:p>
-    <w:p>
-      <w:pPr>
-        <w:tabs>
-          <w:tab w:val="left" w:pos="567"/>
-          <w:tab w:val="left" w:pos="993"/>
-          <w:tab w:val="left" w:pos="1418"/>
-          <w:tab w:val="left" w:pos="1843"/>
-          <w:tab w:val="left" w:pos="2268"/>
-        </w:tabs>
-        <w:snapToGrid w:val="0"/>
-        <w:ind w:left="567" w:hanging="567"/>
-        <w:rPr>
-          <w:spacing w:val="20"/>
-          <w:szCs w:val="20"/>
-        </w:rPr>
-      </w:pPr>
-      <w:r>
-        <w:tab/>
-        <w:t>B.</w:t>
-        <w:tab/>
-        <w:t>CPU 快取大小</w:t>
-      </w:r>
-    </w:p>
-    <w:p>
-      <w:pPr>
-        <w:tabs>
-          <w:tab w:val="left" w:pos="567"/>
-          <w:tab w:val="left" w:pos="993"/>
-          <w:tab w:val="left" w:pos="1418"/>
-          <w:tab w:val="left" w:pos="1843"/>
-          <w:tab w:val="left" w:pos="2268"/>
-        </w:tabs>
-        <w:snapToGrid w:val="0"/>
-        <w:ind w:left="567" w:hanging="567"/>
-        <w:rPr>
-          <w:spacing w:val="20"/>
-          <w:szCs w:val="20"/>
-        </w:rPr>
-      </w:pPr>
-      <w:r>
-        <w:tab/>
-        <w:t>C.</w:t>
-        <w:tab/>
-        <w:t>螢幕解析度</w:t>
-      </w:r>
-    </w:p>
-    <w:p>
-      <w:pPr>
-        <w:tabs>
-          <w:tab w:val="left" w:pos="567"/>
-          <w:tab w:val="left" w:pos="993"/>
-          <w:tab w:val="left" w:pos="1418"/>
-          <w:tab w:val="left" w:pos="1843"/>
-          <w:tab w:val="left" w:pos="2268"/>
-        </w:tabs>
-        <w:snapToGrid w:val="0"/>
-        <w:ind w:left="567" w:hanging="567"/>
-        <w:rPr>
-          <w:spacing w:val="20"/>
-          <w:szCs w:val="20"/>
-        </w:rPr>
-      </w:pPr>
-      <w:r>
-        <w:tab/>
-        <w:t>D.</w:t>
-        <w:tab/>
-        <w:t>鍵盤上的灰塵量</w:t>
-      </w:r>
-    </w:p>
-    <w:p>
-      <w:pPr>
-        <w:tabs>
-          <w:tab w:val="left" w:pos="567"/>
-          <w:tab w:val="left" w:pos="993"/>
-          <w:tab w:val="left" w:pos="1418"/>
-          <w:tab w:val="left" w:pos="1843"/>
-          <w:tab w:val="left" w:pos="2268"/>
-        </w:tabs>
-        <w:snapToGrid w:val="0"/>
-        <w:ind w:left="567" w:hanging="567"/>
-        <w:rPr>
-          <w:spacing w:val="20"/>
-          <w:szCs w:val="20"/>
-        </w:rPr>
-      </w:pPr>
-    </w:p>
-    <w:p>
-      <w:pPr>
-        <w:tabs>
-          <w:tab w:val="left" w:pos="567"/>
-          <w:tab w:val="left" w:pos="993"/>
-          <w:tab w:val="left" w:pos="1418"/>
-          <w:tab w:val="left" w:pos="1843"/>
-          <w:tab w:val="left" w:pos="2268"/>
-        </w:tabs>
-        <w:snapToGrid w:val="0"/>
-        <w:ind w:left="567" w:hanging="567"/>
-        <w:rPr>
-          <w:spacing w:val="20"/>
-          <w:szCs w:val="20"/>
-        </w:rPr>
-      </w:pPr>
-    </w:p>
-    <w:p>
-      <w:pPr>
-        <w:widowControl/>
-        <w:rPr>
-          <w:spacing w:val="20"/>
-          <w:szCs w:val="20"/>
-        </w:rPr>
-      </w:pPr>
-      <w:r>
-        <w:rPr>
-          <w:spacing w:val="20"/>
-          <w:szCs w:val="20"/>
-        </w:rPr>
-        <w:br w:type="page"/>
-      </w:r>
-    </w:p>
-    <w:p>
-      <w:pPr>
-        <w:pStyle w:val="af3"/>
-        <w:numPr>
-          <w:ilvl w:val="0"/>
-          <w:numId w:val="2"/>
-        </w:numPr>
-        <w:tabs>
-          <w:tab w:val="left" w:pos="567"/>
-          <w:tab w:val="left" w:pos="993"/>
-          <w:tab w:val="left" w:pos="1418"/>
-          <w:tab w:val="left" w:pos="1843"/>
-          <w:tab w:val="left" w:pos="2268"/>
-        </w:tabs>
-        <w:snapToGrid w:val="0"/>
-        <w:ind w:leftChars="0" w:left="567" w:hanging="567"/>
-        <w:rPr>
-          <w:spacing w:val="20"/>
-          <w:szCs w:val="20"/>
-        </w:rPr>
-      </w:pPr>
-      <w:r>
-        <w:t>下列哪一項最能描述共享軟件（Shareware）？</w:t>
-      </w:r>
-    </w:p>
-    <w:p>
-      <w:pPr>
-        <w:tabs>
-          <w:tab w:val="left" w:pos="567"/>
-          <w:tab w:val="left" w:pos="993"/>
-          <w:tab w:val="left" w:pos="1418"/>
-          <w:tab w:val="left" w:pos="1843"/>
-          <w:tab w:val="left" w:pos="2268"/>
-        </w:tabs>
-        <w:snapToGrid w:val="0"/>
-        <w:rPr>
-          <w:spacing w:val="20"/>
-          <w:szCs w:val="20"/>
-        </w:rPr>
-      </w:pPr>
-      <w:r/>
-    </w:p>
-    <w:p>
-      <w:pPr>
-        <w:tabs>
-          <w:tab w:val="left" w:pos="567"/>
-          <w:tab w:val="left" w:pos="993"/>
-          <w:tab w:val="left" w:pos="1418"/>
-          <w:tab w:val="left" w:pos="1843"/>
-          <w:tab w:val="left" w:pos="2268"/>
-        </w:tabs>
-        <w:snapToGrid w:val="0"/>
-        <w:ind w:left="567" w:hanging="567"/>
-        <w:rPr>
-          <w:spacing w:val="20"/>
-          <w:szCs w:val="20"/>
-        </w:rPr>
-      </w:pPr>
-      <w:r>
-        <w:tab/>
-        <w:t>A.</w:t>
-        <w:tab/>
-        <w:t>等同開源軟件</w:t>
-      </w:r>
-    </w:p>
-    <w:p>
-      <w:pPr>
-        <w:tabs>
-          <w:tab w:val="left" w:pos="567"/>
-          <w:tab w:val="left" w:pos="993"/>
-          <w:tab w:val="left" w:pos="1418"/>
-          <w:tab w:val="left" w:pos="1843"/>
-          <w:tab w:val="left" w:pos="2268"/>
-        </w:tabs>
-        <w:snapToGrid w:val="0"/>
-        <w:ind w:left="567" w:hanging="567"/>
-        <w:rPr>
-          <w:spacing w:val="20"/>
-          <w:szCs w:val="20"/>
-        </w:rPr>
-      </w:pPr>
-      <w:r>
-        <w:tab/>
-        <w:t>B.</w:t>
-        <w:tab/>
-        <w:t>必定完全免費且無限制</w:t>
-      </w:r>
-    </w:p>
-    <w:p>
-      <w:pPr>
-        <w:tabs>
-          <w:tab w:val="left" w:pos="567"/>
-          <w:tab w:val="left" w:pos="993"/>
-          <w:tab w:val="left" w:pos="1418"/>
-          <w:tab w:val="left" w:pos="1843"/>
-          <w:tab w:val="left" w:pos="2268"/>
-        </w:tabs>
-        <w:snapToGrid w:val="0"/>
-        <w:ind w:left="567" w:hanging="567"/>
-        <w:rPr>
-          <w:spacing w:val="20"/>
-          <w:szCs w:val="20"/>
-        </w:rPr>
-      </w:pPr>
-      <w:r>
-        <w:tab/>
-        <w:t>C.</w:t>
-        <w:tab/>
-        <w:t>只能於伺服器端執行</w:t>
-      </w:r>
-    </w:p>
-    <w:p>
-      <w:pPr>
-        <w:tabs>
-          <w:tab w:val="left" w:pos="567"/>
-          <w:tab w:val="left" w:pos="993"/>
-          <w:tab w:val="left" w:pos="1418"/>
-          <w:tab w:val="left" w:pos="1843"/>
-          <w:tab w:val="left" w:pos="2268"/>
-        </w:tabs>
-        <w:snapToGrid w:val="0"/>
-        <w:ind w:left="567" w:hanging="567"/>
-        <w:rPr>
-          <w:spacing w:val="20"/>
-          <w:szCs w:val="20"/>
-        </w:rPr>
-      </w:pPr>
-      <w:r>
-        <w:tab/>
-        <w:t>D.</w:t>
-        <w:tab/>
-        <w:t>常以便攜式（試用後付費）模式出現</w:t>
-      </w:r>
-    </w:p>
-    <w:p>
-      <w:pPr>
-        <w:tabs>
-          <w:tab w:val="left" w:pos="567"/>
-          <w:tab w:val="left" w:pos="993"/>
-          <w:tab w:val="left" w:pos="1418"/>
-          <w:tab w:val="left" w:pos="1843"/>
-          <w:tab w:val="left" w:pos="2268"/>
-        </w:tabs>
-        <w:snapToGrid w:val="0"/>
-        <w:ind w:left="567" w:hanging="567"/>
-        <w:rPr>
-          <w:spacing w:val="20"/>
-          <w:szCs w:val="20"/>
-        </w:rPr>
-      </w:pPr>
-    </w:p>
-    <w:p>
-      <w:pPr>
-        <w:tabs>
-          <w:tab w:val="left" w:pos="567"/>
-          <w:tab w:val="left" w:pos="993"/>
-          <w:tab w:val="left" w:pos="1418"/>
-          <w:tab w:val="left" w:pos="1843"/>
-          <w:tab w:val="left" w:pos="2268"/>
-        </w:tabs>
-        <w:snapToGrid w:val="0"/>
-        <w:ind w:left="567" w:hanging="567"/>
-        <w:rPr>
-          <w:spacing w:val="20"/>
-          <w:szCs w:val="20"/>
-        </w:rPr>
-      </w:pPr>
-    </w:p>
-    <w:p>
-      <w:pPr>
-        <w:pStyle w:val="af3"/>
-        <w:numPr>
-          <w:ilvl w:val="0"/>
-          <w:numId w:val="2"/>
-        </w:numPr>
-        <w:tabs>
-          <w:tab w:val="left" w:pos="567"/>
-          <w:tab w:val="left" w:pos="993"/>
-          <w:tab w:val="left" w:pos="1418"/>
-          <w:tab w:val="left" w:pos="1843"/>
-          <w:tab w:val="left" w:pos="2268"/>
-        </w:tabs>
-        <w:snapToGrid w:val="0"/>
-        <w:ind w:leftChars="0" w:left="567" w:hanging="567"/>
-        <w:rPr>
-          <w:spacing w:val="20"/>
-          <w:szCs w:val="20"/>
-        </w:rPr>
-      </w:pPr>
-      <w:r>
-        <w:t>下列哪一項最能描述開源軟件（Open-source）授權特點（一般情況）？</w:t>
-      </w:r>
-    </w:p>
-    <w:p>
-      <w:pPr>
-        <w:tabs>
-          <w:tab w:val="left" w:pos="567"/>
-          <w:tab w:val="left" w:pos="993"/>
-          <w:tab w:val="left" w:pos="1418"/>
-          <w:tab w:val="left" w:pos="1843"/>
-          <w:tab w:val="left" w:pos="2268"/>
-        </w:tabs>
-        <w:snapToGrid w:val="0"/>
-        <w:rPr>
-          <w:spacing w:val="20"/>
-          <w:szCs w:val="20"/>
-        </w:rPr>
-      </w:pPr>
-      <w:r/>
-    </w:p>
-    <w:p>
-      <w:pPr>
-        <w:tabs>
-          <w:tab w:val="left" w:pos="567"/>
-          <w:tab w:val="left" w:pos="993"/>
-          <w:tab w:val="left" w:pos="1418"/>
-          <w:tab w:val="left" w:pos="1843"/>
-          <w:tab w:val="left" w:pos="2268"/>
-        </w:tabs>
-        <w:snapToGrid w:val="0"/>
-        <w:ind w:left="567" w:hanging="567"/>
-        <w:rPr>
-          <w:spacing w:val="20"/>
-          <w:szCs w:val="20"/>
-        </w:rPr>
-      </w:pPr>
-      <w:r>
-        <w:tab/>
-        <w:t>A.</w:t>
-        <w:tab/>
-        <w:t>必定不能商業使用</w:t>
-      </w:r>
-    </w:p>
-    <w:p>
-      <w:pPr>
-        <w:tabs>
-          <w:tab w:val="left" w:pos="567"/>
-          <w:tab w:val="left" w:pos="993"/>
-          <w:tab w:val="left" w:pos="1418"/>
-          <w:tab w:val="left" w:pos="1843"/>
-          <w:tab w:val="left" w:pos="2268"/>
-        </w:tabs>
-        <w:snapToGrid w:val="0"/>
-        <w:ind w:left="567" w:hanging="567"/>
-        <w:rPr>
-          <w:spacing w:val="20"/>
-          <w:szCs w:val="20"/>
-        </w:rPr>
-      </w:pPr>
-      <w:r>
-        <w:tab/>
-        <w:t>B.</w:t>
-        <w:tab/>
-        <w:t>等同免費軟件</w:t>
-      </w:r>
-    </w:p>
-    <w:p>
-      <w:pPr>
-        <w:tabs>
-          <w:tab w:val="left" w:pos="567"/>
-          <w:tab w:val="left" w:pos="993"/>
-          <w:tab w:val="left" w:pos="1418"/>
-          <w:tab w:val="left" w:pos="1843"/>
-          <w:tab w:val="left" w:pos="2268"/>
-        </w:tabs>
-        <w:snapToGrid w:val="0"/>
-        <w:ind w:left="567" w:hanging="567"/>
-        <w:rPr>
-          <w:spacing w:val="20"/>
-          <w:szCs w:val="20"/>
-        </w:rPr>
-      </w:pPr>
-      <w:r>
-        <w:tab/>
-        <w:t>C.</w:t>
-        <w:tab/>
-        <w:t>原始碼必定不可檢視</w:t>
-      </w:r>
-    </w:p>
-    <w:p>
-      <w:pPr>
-        <w:tabs>
-          <w:tab w:val="left" w:pos="567"/>
-          <w:tab w:val="left" w:pos="993"/>
-          <w:tab w:val="left" w:pos="1418"/>
-          <w:tab w:val="left" w:pos="1843"/>
-          <w:tab w:val="left" w:pos="2268"/>
-        </w:tabs>
-        <w:snapToGrid w:val="0"/>
-        <w:ind w:left="567" w:hanging="567"/>
-        <w:rPr>
-          <w:spacing w:val="20"/>
-          <w:szCs w:val="20"/>
-        </w:rPr>
-      </w:pPr>
-      <w:r>
-        <w:tab/>
-        <w:t>D.</w:t>
-        <w:tab/>
-        <w:t>通常允許檢視／修改與再分發（視授權條款而定）</w:t>
-      </w:r>
-    </w:p>
-    <w:p>
-      <w:pPr>
-        <w:tabs>
-          <w:tab w:val="left" w:pos="567"/>
-          <w:tab w:val="left" w:pos="993"/>
-          <w:tab w:val="left" w:pos="1418"/>
-          <w:tab w:val="left" w:pos="1843"/>
-          <w:tab w:val="left" w:pos="2268"/>
-        </w:tabs>
-        <w:snapToGrid w:val="0"/>
-        <w:ind w:left="567" w:hanging="567"/>
-        <w:rPr>
-          <w:spacing w:val="20"/>
-          <w:szCs w:val="20"/>
-        </w:rPr>
-      </w:pPr>
-    </w:p>
-    <w:p>
-      <w:pPr>
-        <w:tabs>
-          <w:tab w:val="left" w:pos="567"/>
-          <w:tab w:val="left" w:pos="993"/>
-          <w:tab w:val="left" w:pos="1418"/>
-          <w:tab w:val="left" w:pos="1843"/>
-          <w:tab w:val="left" w:pos="2268"/>
-        </w:tabs>
-        <w:snapToGrid w:val="0"/>
-        <w:ind w:left="567" w:hanging="567"/>
-        <w:rPr>
-          <w:spacing w:val="20"/>
-          <w:szCs w:val="20"/>
-        </w:rPr>
-      </w:pPr>
-    </w:p>
-    <w:p>
-      <w:pPr>
-        <w:pStyle w:val="af3"/>
-        <w:numPr>
-          <w:ilvl w:val="0"/>
-          <w:numId w:val="2"/>
-        </w:numPr>
-        <w:tabs>
-          <w:tab w:val="left" w:pos="567"/>
-          <w:tab w:val="left" w:pos="993"/>
-          <w:tab w:val="left" w:pos="1418"/>
-          <w:tab w:val="left" w:pos="1843"/>
-          <w:tab w:val="left" w:pos="2268"/>
-        </w:tabs>
-        <w:snapToGrid w:val="0"/>
-        <w:ind w:leftChars="0" w:left="567" w:hanging="567"/>
-        <w:rPr>
-          <w:spacing w:val="20"/>
-          <w:szCs w:val="20"/>
-        </w:rPr>
-      </w:pPr>
-      <w:r>
-        <w:t>在關聯式資料庫中，主鍵（Primary Key）的主要作用是？</w:t>
-      </w:r>
-    </w:p>
-    <w:p>
-      <w:pPr>
-        <w:tabs>
-          <w:tab w:val="left" w:pos="567"/>
-          <w:tab w:val="left" w:pos="993"/>
-          <w:tab w:val="left" w:pos="1418"/>
-          <w:tab w:val="left" w:pos="1843"/>
-          <w:tab w:val="left" w:pos="2268"/>
-        </w:tabs>
-        <w:snapToGrid w:val="0"/>
-        <w:rPr>
-          <w:spacing w:val="20"/>
-          <w:szCs w:val="20"/>
-        </w:rPr>
-      </w:pPr>
-      <w:r/>
-    </w:p>
-    <w:p>
-      <w:pPr>
-        <w:tabs>
-          <w:tab w:val="left" w:pos="567"/>
-          <w:tab w:val="left" w:pos="993"/>
-          <w:tab w:val="left" w:pos="1418"/>
-          <w:tab w:val="left" w:pos="1843"/>
-          <w:tab w:val="left" w:pos="2268"/>
-        </w:tabs>
-        <w:snapToGrid w:val="0"/>
-        <w:ind w:left="567" w:hanging="567"/>
-        <w:rPr>
-          <w:spacing w:val="20"/>
-          <w:szCs w:val="20"/>
-        </w:rPr>
-      </w:pPr>
-      <w:r>
-        <w:tab/>
-        <w:tab/>
-        <w:t>(1)</w:t>
-        <w:tab/>
-        <w:t>唯一識別每一筆記錄</w:t>
-      </w:r>
-    </w:p>
-    <w:p>
-      <w:pPr>
-        <w:tabs>
-          <w:tab w:val="left" w:pos="567"/>
-          <w:tab w:val="left" w:pos="993"/>
-          <w:tab w:val="left" w:pos="1418"/>
-          <w:tab w:val="left" w:pos="1843"/>
-          <w:tab w:val="left" w:pos="2268"/>
-        </w:tabs>
-        <w:snapToGrid w:val="0"/>
-        <w:ind w:left="567" w:hanging="567"/>
-        <w:rPr>
-          <w:spacing w:val="20"/>
-          <w:szCs w:val="20"/>
-        </w:rPr>
-      </w:pPr>
-      <w:r>
-        <w:tab/>
-        <w:tab/>
-        <w:t>(2)</w:t>
-        <w:tab/>
-        <w:t>自動把兩個資料表合併</w:t>
-      </w:r>
-    </w:p>
-    <w:p>
-      <w:pPr>
-        <w:tabs>
-          <w:tab w:val="left" w:pos="567"/>
-          <w:tab w:val="left" w:pos="993"/>
-          <w:tab w:val="left" w:pos="1418"/>
-          <w:tab w:val="left" w:pos="1843"/>
-          <w:tab w:val="left" w:pos="2268"/>
-        </w:tabs>
-        <w:snapToGrid w:val="0"/>
-        <w:ind w:left="567" w:hanging="567"/>
-        <w:rPr>
-          <w:spacing w:val="20"/>
-          <w:szCs w:val="20"/>
-        </w:rPr>
-      </w:pPr>
-      <w:r>
-        <w:tab/>
-        <w:tab/>
-        <w:t>(3)</w:t>
-        <w:tab/>
-        <w:t>保證所有欄位均為文字型別</w:t>
-      </w:r>
-    </w:p>
-    <w:p>
-      <w:pPr>
-        <w:tabs>
-          <w:tab w:val="left" w:pos="567"/>
-          <w:tab w:val="left" w:pos="993"/>
-          <w:tab w:val="left" w:pos="1418"/>
-          <w:tab w:val="left" w:pos="1843"/>
-          <w:tab w:val="left" w:pos="2268"/>
-        </w:tabs>
-        <w:snapToGrid w:val="0"/>
-        <w:ind w:left="567" w:hanging="567"/>
-        <w:rPr>
-          <w:spacing w:val="20"/>
-          <w:szCs w:val="20"/>
-        </w:rPr>
-      </w:pPr>
-      <w:r/>
-    </w:p>
-    <w:p>
-      <w:pPr>
-        <w:tabs>
-          <w:tab w:val="left" w:pos="567"/>
-          <w:tab w:val="left" w:pos="993"/>
-          <w:tab w:val="left" w:pos="1418"/>
-          <w:tab w:val="left" w:pos="1843"/>
-          <w:tab w:val="left" w:pos="2268"/>
-        </w:tabs>
-        <w:snapToGrid w:val="0"/>
-        <w:ind w:left="567" w:hanging="567"/>
-        <w:rPr>
-          <w:spacing w:val="20"/>
-          <w:szCs w:val="20"/>
-        </w:rPr>
-      </w:pPr>
-      <w:r>
-        <w:tab/>
-        <w:t>A.</w:t>
-        <w:tab/>
-        <w:t>只有 (1)</w:t>
-      </w:r>
-    </w:p>
-    <w:p>
-      <w:pPr>
-        <w:tabs>
-          <w:tab w:val="left" w:pos="567"/>
-          <w:tab w:val="left" w:pos="993"/>
-          <w:tab w:val="left" w:pos="1418"/>
-          <w:tab w:val="left" w:pos="1843"/>
-          <w:tab w:val="left" w:pos="2268"/>
-        </w:tabs>
-        <w:snapToGrid w:val="0"/>
-        <w:ind w:left="567" w:hanging="567"/>
-        <w:rPr>
-          <w:spacing w:val="20"/>
-          <w:szCs w:val="20"/>
-        </w:rPr>
-      </w:pPr>
-      <w:r>
-        <w:tab/>
-        <w:t>B.</w:t>
-        <w:tab/>
-        <w:t>(1) 正確</w:t>
-      </w:r>
-    </w:p>
-    <w:p>
-      <w:pPr>
-        <w:tabs>
-          <w:tab w:val="left" w:pos="567"/>
-          <w:tab w:val="left" w:pos="993"/>
-          <w:tab w:val="left" w:pos="1418"/>
-          <w:tab w:val="left" w:pos="1843"/>
-          <w:tab w:val="left" w:pos="2268"/>
-        </w:tabs>
-        <w:snapToGrid w:val="0"/>
-        <w:ind w:left="567" w:hanging="567"/>
-        <w:rPr>
-          <w:spacing w:val="20"/>
-          <w:szCs w:val="20"/>
-        </w:rPr>
-      </w:pPr>
-      <w:r>
-        <w:tab/>
-        <w:t>C.</w:t>
-        <w:tab/>
-        <w:t>只有 (2)</w:t>
-      </w:r>
-    </w:p>
-    <w:p>
-      <w:pPr>
-        <w:tabs>
-          <w:tab w:val="left" w:pos="567"/>
-          <w:tab w:val="left" w:pos="993"/>
-          <w:tab w:val="left" w:pos="1418"/>
-          <w:tab w:val="left" w:pos="1843"/>
-          <w:tab w:val="left" w:pos="2268"/>
-        </w:tabs>
-        <w:snapToGrid w:val="0"/>
-        <w:ind w:left="567" w:hanging="567"/>
-        <w:rPr>
-          <w:spacing w:val="20"/>
-          <w:szCs w:val="20"/>
-        </w:rPr>
-      </w:pPr>
-      <w:r>
-        <w:tab/>
-        <w:t>D.</w:t>
-        <w:tab/>
-        <w:t>只有 (3)</w:t>
-      </w:r>
-    </w:p>
-    <w:p>
-      <w:pPr>
-        <w:tabs>
-          <w:tab w:val="left" w:pos="567"/>
-          <w:tab w:val="left" w:pos="993"/>
-          <w:tab w:val="left" w:pos="1418"/>
-          <w:tab w:val="left" w:pos="1843"/>
-          <w:tab w:val="left" w:pos="2268"/>
-        </w:tabs>
-        <w:snapToGrid w:val="0"/>
-        <w:ind w:left="567" w:hanging="567"/>
-        <w:rPr>
-          <w:spacing w:val="20"/>
-          <w:szCs w:val="20"/>
-        </w:rPr>
-      </w:pPr>
-    </w:p>
-    <w:p>
-      <w:pPr>
-        <w:widowControl/>
-        <w:rPr>
-          <w:spacing w:val="20"/>
-          <w:szCs w:val="20"/>
-        </w:rPr>
-      </w:pPr>
-    </w:p>
-    <w:p>
-      <w:pPr>
-        <w:pStyle w:val="af3"/>
-        <w:numPr>
-          <w:ilvl w:val="0"/>
-          <w:numId w:val="2"/>
-        </w:numPr>
-        <w:tabs>
-          <w:tab w:val="left" w:pos="567"/>
-          <w:tab w:val="left" w:pos="993"/>
-          <w:tab w:val="left" w:pos="1418"/>
-          <w:tab w:val="left" w:pos="1843"/>
-          <w:tab w:val="left" w:pos="2268"/>
-        </w:tabs>
-        <w:snapToGrid w:val="0"/>
-        <w:ind w:leftChars="0" w:left="567" w:hanging="567"/>
-        <w:rPr>
-          <w:spacing w:val="20"/>
-          <w:szCs w:val="20"/>
-        </w:rPr>
-      </w:pPr>
-      <w:r>
-        <w:t>外鍵（Foreign Key）的主要用途是？</w:t>
-      </w:r>
-    </w:p>
-    <w:p>
-      <w:pPr>
-        <w:tabs>
-          <w:tab w:val="left" w:pos="567"/>
-          <w:tab w:val="left" w:pos="993"/>
-          <w:tab w:val="left" w:pos="1418"/>
-          <w:tab w:val="left" w:pos="1843"/>
-          <w:tab w:val="left" w:pos="2268"/>
-        </w:tabs>
-        <w:snapToGrid w:val="0"/>
-        <w:rPr>
-          <w:spacing w:val="20"/>
-          <w:szCs w:val="20"/>
-        </w:rPr>
-      </w:pPr>
-      <w:r/>
-    </w:p>
-    <w:p>
-      <w:pPr>
-        <w:tabs>
-          <w:tab w:val="left" w:pos="567"/>
-          <w:tab w:val="left" w:pos="993"/>
-          <w:tab w:val="left" w:pos="1418"/>
-          <w:tab w:val="left" w:pos="1843"/>
-          <w:tab w:val="left" w:pos="2268"/>
-        </w:tabs>
-        <w:snapToGrid w:val="0"/>
-        <w:ind w:left="567" w:hanging="567"/>
-        <w:rPr>
-          <w:spacing w:val="20"/>
-          <w:szCs w:val="20"/>
-        </w:rPr>
-      </w:pPr>
-      <w:r>
-        <w:tab/>
-        <w:tab/>
-        <w:t>(1)</w:t>
-        <w:tab/>
-        <w:t>建立資料表之間的參照完整性</w:t>
-      </w:r>
-    </w:p>
-    <w:p>
-      <w:pPr>
-        <w:tabs>
-          <w:tab w:val="left" w:pos="567"/>
-          <w:tab w:val="left" w:pos="993"/>
-          <w:tab w:val="left" w:pos="1418"/>
-          <w:tab w:val="left" w:pos="1843"/>
-          <w:tab w:val="left" w:pos="2268"/>
-        </w:tabs>
-        <w:snapToGrid w:val="0"/>
-        <w:ind w:left="567" w:hanging="567"/>
-        <w:rPr>
-          <w:spacing w:val="20"/>
-          <w:szCs w:val="20"/>
-        </w:rPr>
-      </w:pPr>
-      <w:r>
-        <w:tab/>
-        <w:tab/>
-        <w:t>(2)</w:t>
-        <w:tab/>
-        <w:t>把資料表所有欄位加密</w:t>
-      </w:r>
-    </w:p>
-    <w:p>
-      <w:pPr>
-        <w:tabs>
-          <w:tab w:val="left" w:pos="567"/>
-          <w:tab w:val="left" w:pos="993"/>
-          <w:tab w:val="left" w:pos="1418"/>
-          <w:tab w:val="left" w:pos="1843"/>
-          <w:tab w:val="left" w:pos="2268"/>
-        </w:tabs>
-        <w:snapToGrid w:val="0"/>
-        <w:ind w:left="567" w:hanging="567"/>
-        <w:rPr>
-          <w:spacing w:val="20"/>
-          <w:szCs w:val="20"/>
-        </w:rPr>
-      </w:pPr>
-      <w:r>
-        <w:tab/>
-        <w:tab/>
-        <w:t>(3)</w:t>
-        <w:tab/>
-        <w:t>取代主鍵成為唯一識別碼</w:t>
-      </w:r>
-    </w:p>
-    <w:p>
-      <w:pPr>
-        <w:tabs>
-          <w:tab w:val="left" w:pos="567"/>
-          <w:tab w:val="left" w:pos="993"/>
-          <w:tab w:val="left" w:pos="1418"/>
-          <w:tab w:val="left" w:pos="1843"/>
-          <w:tab w:val="left" w:pos="2268"/>
-        </w:tabs>
-        <w:snapToGrid w:val="0"/>
-        <w:rPr>
-          <w:spacing w:val="20"/>
-          <w:szCs w:val="20"/>
-        </w:rPr>
-      </w:pPr>
-      <w:r/>
-    </w:p>
-    <w:p>
-      <w:pPr>
-        <w:tabs>
-          <w:tab w:val="left" w:pos="567"/>
-          <w:tab w:val="left" w:pos="993"/>
-          <w:tab w:val="left" w:pos="1418"/>
-          <w:tab w:val="left" w:pos="1843"/>
-          <w:tab w:val="left" w:pos="2268"/>
-        </w:tabs>
-        <w:snapToGrid w:val="0"/>
-        <w:ind w:left="567" w:hanging="567"/>
-        <w:rPr>
-          <w:spacing w:val="20"/>
-          <w:szCs w:val="20"/>
-        </w:rPr>
-      </w:pPr>
-      <w:r>
-        <w:tab/>
-        <w:t>A.</w:t>
-        <w:tab/>
-        <w:t>只有 (1)</w:t>
-      </w:r>
-    </w:p>
-    <w:p>
-      <w:pPr>
-        <w:tabs>
-          <w:tab w:val="left" w:pos="567"/>
-          <w:tab w:val="left" w:pos="993"/>
-          <w:tab w:val="left" w:pos="1418"/>
-          <w:tab w:val="left" w:pos="1843"/>
-          <w:tab w:val="left" w:pos="2268"/>
-        </w:tabs>
-        <w:snapToGrid w:val="0"/>
-        <w:ind w:left="567" w:hanging="567"/>
-        <w:rPr>
-          <w:spacing w:val="20"/>
-          <w:szCs w:val="20"/>
-        </w:rPr>
-      </w:pPr>
-      <w:r>
-        <w:tab/>
-        <w:t>B.</w:t>
-        <w:tab/>
-        <w:t>(1) 正確</w:t>
-      </w:r>
-    </w:p>
-    <w:p>
-      <w:pPr>
-        <w:tabs>
-          <w:tab w:val="left" w:pos="567"/>
-          <w:tab w:val="left" w:pos="993"/>
-          <w:tab w:val="left" w:pos="1418"/>
-          <w:tab w:val="left" w:pos="1843"/>
-          <w:tab w:val="left" w:pos="2268"/>
-        </w:tabs>
-        <w:snapToGrid w:val="0"/>
-        <w:ind w:left="567" w:hanging="567"/>
-        <w:rPr>
-          <w:spacing w:val="20"/>
-          <w:szCs w:val="20"/>
-        </w:rPr>
-      </w:pPr>
-      <w:r>
-        <w:tab/>
-        <w:t>C.</w:t>
-        <w:tab/>
-        <w:t>只有 (1) 和 (3)</w:t>
-      </w:r>
-    </w:p>
-    <w:p>
-      <w:pPr>
-        <w:tabs>
-          <w:tab w:val="left" w:pos="567"/>
-          <w:tab w:val="left" w:pos="993"/>
-          <w:tab w:val="left" w:pos="1418"/>
-          <w:tab w:val="left" w:pos="1843"/>
-          <w:tab w:val="left" w:pos="2268"/>
-        </w:tabs>
-        <w:snapToGrid w:val="0"/>
-        <w:ind w:left="567" w:hanging="567"/>
-        <w:rPr>
-          <w:spacing w:val="20"/>
-          <w:szCs w:val="20"/>
-        </w:rPr>
-      </w:pPr>
-      <w:r>
-        <w:tab/>
-        <w:t>D.</w:t>
-        <w:tab/>
-        <w:t>只有 (2)</w:t>
-      </w:r>
-    </w:p>
-    <w:p>
-      <w:pPr>
-        <w:tabs>
-          <w:tab w:val="left" w:pos="567"/>
-          <w:tab w:val="left" w:pos="993"/>
-          <w:tab w:val="left" w:pos="1418"/>
-          <w:tab w:val="left" w:pos="1843"/>
-          <w:tab w:val="left" w:pos="2268"/>
-        </w:tabs>
-        <w:snapToGrid w:val="0"/>
-        <w:ind w:left="567" w:hanging="567"/>
-        <w:rPr>
-          <w:spacing w:val="20"/>
-          <w:szCs w:val="20"/>
-        </w:rPr>
-      </w:pPr>
-    </w:p>
-    <w:p>
-      <w:pPr>
-        <w:tabs>
-          <w:tab w:val="left" w:pos="567"/>
-          <w:tab w:val="left" w:pos="993"/>
-          <w:tab w:val="left" w:pos="1418"/>
-          <w:tab w:val="left" w:pos="1843"/>
-          <w:tab w:val="left" w:pos="2268"/>
-        </w:tabs>
-        <w:snapToGrid w:val="0"/>
-        <w:ind w:left="567" w:hanging="567"/>
-        <w:rPr>
-          <w:spacing w:val="20"/>
-          <w:szCs w:val="20"/>
-        </w:rPr>
-      </w:pPr>
-    </w:p>
-    <w:p>
-      <w:pPr>
-        <w:pStyle w:val="af3"/>
-        <w:numPr>
-          <w:ilvl w:val="0"/>
-          <w:numId w:val="2"/>
-        </w:numPr>
-        <w:tabs>
-          <w:tab w:val="left" w:pos="567"/>
-          <w:tab w:val="left" w:pos="993"/>
-          <w:tab w:val="left" w:pos="1418"/>
-          <w:tab w:val="left" w:pos="1843"/>
-          <w:tab w:val="left" w:pos="2268"/>
-        </w:tabs>
-        <w:snapToGrid w:val="0"/>
-        <w:ind w:leftChars="0" w:left="567" w:hanging="567"/>
-        <w:rPr>
-          <w:spacing w:val="20"/>
-          <w:szCs w:val="20"/>
-        </w:rPr>
-      </w:pPr>
-      <w:r>
-        <w:t>下列偽代碼用於找出陣列 L 的次大值（假設長度≥2 且存在次大值）：</w:t>
-      </w:r>
-    </w:p>
-    <w:p>
-      <w:pPr>
-        <w:tabs>
-          <w:tab w:val="left" w:pos="567"/>
-          <w:tab w:val="left" w:pos="993"/>
-          <w:tab w:val="left" w:pos="1418"/>
-          <w:tab w:val="left" w:pos="1843"/>
-          <w:tab w:val="left" w:pos="2268"/>
-        </w:tabs>
-        <w:snapToGrid w:val="0"/>
-        <w:rPr>
-          <w:spacing w:val="20"/>
-          <w:szCs w:val="20"/>
-        </w:rPr>
-      </w:pPr>
-      <w:r>
-        <w:tab/>
-      </w:r>
     </w:p>
     <w:tbl>
       <w:tblPr>
@@ -6701,7 +6702,9 @@
           <w:szCs w:val="20"/>
         </w:rPr>
       </w:pPr>
-      <w:r/>
+      <w:r>
+        <w:t>下列哪句最恰當描述此資訊處理流程？</w:t>
+      </w:r>
     </w:p>
     <w:p>
       <w:pPr>
@@ -6719,10 +6722,7 @@
           <w:szCs w:val="20"/>
         </w:rPr>
       </w:pPr>
-      <w:r>
-        <w:tab/>
-        <w:t>若 L = [10, 5, 20, 8, 20, 15]，迴圈結束後 second 的值是？</w:t>
-      </w:r>
+      <w:r/>
     </w:p>
     <w:p>
       <w:pPr>
@@ -6763,7 +6763,7 @@
         <w:tab/>
         <w:t>A.</w:t>
         <w:tab/>
-        <w:t>20</w:t>
+        <w:t>問卷輸入屬輸入；試算表分析屬處理</w:t>
       </w:r>
     </w:p>
     <w:p>
@@ -6787,7 +6787,7 @@
         <w:tab/>
         <w:t>B.</w:t>
         <w:tab/>
-        <w:t>10</w:t>
+        <w:t>不需收集數據</w:t>
       </w:r>
     </w:p>
     <w:p>
@@ -6811,7 +6811,7 @@
         <w:tab/>
         <w:t>C.</w:t>
         <w:tab/>
-        <w:t>15</w:t>
+        <w:t>只屬輸出階段</w:t>
       </w:r>
     </w:p>
     <w:p>
@@ -6835,7 +6835,7 @@
         <w:tab/>
         <w:t>D.</w:t>
         <w:tab/>
-        <w:t>8</w:t>
+        <w:t>沒有處理階段</w:t>
       </w:r>
     </w:p>
     <w:p>
@@ -6910,7 +6910,7 @@
         </w:rPr>
       </w:pPr>
       <w:r>
-        <w:t>下列演算法的輸出是？</w:t>
+        <w:t>一段短片：</w:t>
       </w:r>
     </w:p>
     <w:p>
@@ -6930,72 +6930,6 @@
         </w:rPr>
       </w:pPr>
       <w:r/>
-    </w:p>
-    <w:p>
-      <w:pPr>
-        <w:tabs>
-          <w:tab w:val="left" w:pos="567"/>
-          <w:tab w:val="left" w:pos="993"/>
-          <w:tab w:val="left" w:pos="1418"/>
-          <w:tab w:val="left" w:pos="1843"/>
-          <w:tab w:val="left" w:pos="2268"/>
-        </w:tabs>
-        <w:snapToGrid w:val="0"/>
-        <w:ind w:left="567" w:hanging="567"/>
-        <w:rPr>
-          <w:rFonts w:ascii="Courier New" w:hAnsi="Courier New" w:cs="Courier New"/>
-          <w:spacing w:val="20"/>
-          <w:szCs w:val="20"/>
-        </w:rPr>
-      </w:pPr>
-      <w:r>
-        <w:tab/>
-        <w:t xml:space="preserve">N ← 1  </w:t>
-      </w:r>
-    </w:p>
-    <w:p>
-      <w:pPr>
-        <w:tabs>
-          <w:tab w:val="left" w:pos="567"/>
-          <w:tab w:val="left" w:pos="993"/>
-          <w:tab w:val="left" w:pos="1418"/>
-          <w:tab w:val="left" w:pos="1843"/>
-          <w:tab w:val="left" w:pos="2268"/>
-        </w:tabs>
-        <w:snapToGrid w:val="0"/>
-        <w:ind w:left="567" w:hanging="567"/>
-        <w:rPr>
-          <w:rFonts w:ascii="Courier New" w:hAnsi="Courier New" w:cs="Courier New"/>
-          <w:spacing w:val="20"/>
-          <w:szCs w:val="20"/>
-        </w:rPr>
-      </w:pPr>
-      <w:r>
-        <w:tab/>
-        <w:t xml:space="preserve">S ← 0  </w:t>
-      </w:r>
-    </w:p>
-    <w:p>
-      <w:pPr>
-        <w:tabs>
-          <w:tab w:val="left" w:pos="567"/>
-          <w:tab w:val="left" w:pos="993"/>
-          <w:tab w:val="left" w:pos="1418"/>
-          <w:tab w:val="left" w:pos="1843"/>
-          <w:tab w:val="left" w:pos="2268"/>
-        </w:tabs>
-        <w:snapToGrid w:val="0"/>
-        <w:ind w:left="567" w:hanging="567"/>
-        <w:rPr>
-          <w:rFonts w:ascii="Courier New" w:hAnsi="Courier New" w:cs="Courier New"/>
-          <w:spacing w:val="20"/>
-          <w:szCs w:val="20"/>
-        </w:rPr>
-      </w:pPr>
-      <w:r>
-        <w:tab/>
-        <w:t xml:space="preserve">FOR i ← 1 TO 4  </w:t>
-      </w:r>
     </w:p>
     <w:p>
       <w:pPr>
@@ -7017,7 +6951,7 @@
       <w:r>
         <w:tab/>
         <w:tab/>
-        <w:t xml:space="preserve">S ← S + N  </w:t>
+        <w:t>解析度 640×480</w:t>
       </w:r>
     </w:p>
     <w:p>
@@ -7040,7 +6974,7 @@
       <w:r>
         <w:tab/>
         <w:tab/>
-        <w:t xml:space="preserve">N ← N + 2  </w:t>
+        <w:t>幀率 25 fps</w:t>
       </w:r>
     </w:p>
     <w:p>
@@ -7062,7 +6996,72 @@
       </w:pPr>
       <w:r>
         <w:tab/>
-        <w:t xml:space="preserve">OUTPUT S  </w:t>
+        <w:tab/>
+        <w:t>每幀未壓縮約 1 MB</w:t>
+      </w:r>
+    </w:p>
+    <w:p>
+      <w:pPr>
+        <w:tabs>
+          <w:tab w:val="left" w:pos="567"/>
+          <w:tab w:val="left" w:pos="993"/>
+          <w:tab w:val="left" w:pos="1418"/>
+          <w:tab w:val="left" w:pos="1843"/>
+          <w:tab w:val="left" w:pos="2268"/>
+        </w:tabs>
+        <w:snapToGrid w:val="0"/>
+        <w:ind w:left="567" w:hanging="567"/>
+        <w:rPr>
+          <w:rFonts w:ascii="Courier New" w:hAnsi="Courier New" w:cs="Courier New"/>
+          <w:spacing w:val="20"/>
+          <w:szCs w:val="20"/>
+        </w:rPr>
+      </w:pPr>
+      <w:r>
+        <w:tab/>
+        <w:tab/>
+        <w:t>長度 2 秒</w:t>
+      </w:r>
+    </w:p>
+    <w:p>
+      <w:pPr>
+        <w:tabs>
+          <w:tab w:val="left" w:pos="567"/>
+          <w:tab w:val="left" w:pos="993"/>
+          <w:tab w:val="left" w:pos="1418"/>
+          <w:tab w:val="left" w:pos="1843"/>
+          <w:tab w:val="left" w:pos="2268"/>
+        </w:tabs>
+        <w:snapToGrid w:val="0"/>
+        <w:ind w:left="567" w:hanging="567"/>
+        <w:rPr>
+          <w:rFonts w:ascii="Courier New" w:hAnsi="Courier New" w:cs="Courier New"/>
+          <w:spacing w:val="20"/>
+          <w:szCs w:val="20"/>
+        </w:rPr>
+      </w:pPr>
+      <w:r/>
+    </w:p>
+    <w:p>
+      <w:pPr>
+        <w:tabs>
+          <w:tab w:val="left" w:pos="567"/>
+          <w:tab w:val="left" w:pos="993"/>
+          <w:tab w:val="left" w:pos="1418"/>
+          <w:tab w:val="left" w:pos="1843"/>
+          <w:tab w:val="left" w:pos="2268"/>
+        </w:tabs>
+        <w:snapToGrid w:val="0"/>
+        <w:ind w:left="567" w:hanging="567"/>
+        <w:rPr>
+          <w:rFonts w:ascii="Courier New" w:hAnsi="Courier New" w:cs="Courier New"/>
+          <w:spacing w:val="20"/>
+          <w:szCs w:val="20"/>
+        </w:rPr>
+      </w:pPr>
+      <w:r>
+        <w:tab/>
+        <w:t>下列何者最接近未壓縮檔案大小？</w:t>
       </w:r>
     </w:p>
     <w:p>
@@ -7103,7 +7102,7 @@
         <w:tab/>
         <w:t>A.</w:t>
         <w:tab/>
-        <w:t>25</w:t>
+        <w:t>約 100 MB</w:t>
       </w:r>
     </w:p>
     <w:p>
@@ -7126,7 +7125,7 @@
         <w:tab/>
         <w:t>B.</w:t>
         <w:tab/>
-        <w:t>20</w:t>
+        <w:t>約 25 MB</w:t>
       </w:r>
     </w:p>
     <w:p>
@@ -7149,7 +7148,7 @@
         <w:tab/>
         <w:t>C.</w:t>
         <w:tab/>
-        <w:t>16</w:t>
+        <w:t>約 50 MB</w:t>
       </w:r>
     </w:p>
     <w:p>
@@ -7172,7 +7171,7 @@
         <w:tab/>
         <w:t>D.</w:t>
         <w:tab/>
-        <w:t>9</w:t>
+        <w:t>約 200 MB</w:t>
       </w:r>
     </w:p>
     <w:p>
@@ -7223,7 +7222,7 @@
         </w:rPr>
       </w:pPr>
       <w:r>
-        <w:t>下列關於資料庫正規化的敘述，何者較正確？</w:t>
+        <w:t>下列哪項（些）關於檔案組織與存取的句子是正確的？</w:t>
       </w:r>
     </w:p>
     <w:p>
@@ -7266,7 +7265,7 @@
         <w:tab/>
         <w:t>(1)</w:t>
         <w:tab/>
-        <w:t>1NF 要求屬性值為不可再分的原子值</w:t>
+        <w:t>文字檔可按行順序讀取</w:t>
       </w:r>
     </w:p>
     <w:p>
@@ -7291,7 +7290,7 @@
         <w:tab/>
         <w:t>(2)</w:t>
         <w:tab/>
-        <w:t>2NF 消除非鍵屬性對候選鍵的部分函數相依</w:t>
+        <w:t>隨機存取檔案可配合索引定位記錄</w:t>
       </w:r>
     </w:p>
     <w:p>
@@ -7316,7 +7315,7 @@
         <w:tab/>
         <w:t>(3)</w:t>
         <w:tab/>
-        <w:t>3NF 消除遞移函數相依</w:t>
+        <w:t>所有檔案均只能用順序存取</w:t>
       </w:r>
     </w:p>
     <w:p>
@@ -7531,7 +7530,7 @@
         </w:rPr>
       </w:pPr>
       <w:r>
-        <w:t>在 n 個已排序元素中尋找特定值，下列哪種方法通常較有效率？</w:t>
+        <w:t>下列哪項最屬於「專用軟件」？</w:t>
       </w:r>
     </w:p>
     <w:p>
@@ -7994,7 +7993,7 @@
         <w:tab/>
         <w:t>A.</w:t>
         <w:tab/>
-        <w:t>冒泡排序</w:t>
+        <w:t>醫院掛號系統</w:t>
       </w:r>
     </w:p>
     <w:p>
@@ -8017,7 +8016,7 @@
         <w:tab/>
         <w:t>B.</w:t>
         <w:tab/>
-        <w:t>線性搜尋</w:t>
+        <w:t>文字處理器</w:t>
       </w:r>
     </w:p>
     <w:p>
@@ -8040,7 +8039,7 @@
         <w:tab/>
         <w:t>C.</w:t>
         <w:tab/>
-        <w:t>二分搜尋</w:t>
+        <w:t>網頁瀏覽器</w:t>
       </w:r>
     </w:p>
     <w:p>
@@ -8063,7 +8062,7 @@
         <w:tab/>
         <w:t>D.</w:t>
         <w:tab/>
-        <w:t>逐一列印所有元素</w:t>
+        <w:t>試算表</w:t>
       </w:r>
     </w:p>
     <w:p>
@@ -8122,7 +8121,7 @@
         </w:rPr>
       </w:pPr>
       <w:r>
-        <w:t>在程式設計中，把重複使用的邏輯封裝成可獨立測試的小單元，最能體現哪項原則？</w:t>
+        <w:t>一幅點陣圖每像素以 8 bit 儲存顏色。下列哪項正確？</w:t>
       </w:r>
     </w:p>
     <w:p>
@@ -8162,7 +8161,7 @@
         <w:tab/>
         <w:t>A.</w:t>
         <w:tab/>
-        <w:t>無限迴圈</w:t>
+        <w:t>65536</w:t>
       </w:r>
     </w:p>
     <w:p>
@@ -8185,7 +8184,7 @@
         <w:tab/>
         <w:t>B.</w:t>
         <w:tab/>
-        <w:t>模組化（Modularisation）</w:t>
+        <w:t>256</w:t>
       </w:r>
     </w:p>
     <w:p>
@@ -8208,7 +8207,7 @@
         <w:tab/>
         <w:t>C.</w:t>
         <w:tab/>
-        <w:t>循序結構</w:t>
+        <w:t>16777216</w:t>
       </w:r>
     </w:p>
     <w:p>
@@ -8231,7 +8230,7 @@
         <w:tab/>
         <w:t>D.</w:t>
         <w:tab/>
-        <w:t>單一巨型程式檔</w:t>
+        <w:t>16</w:t>
       </w:r>
     </w:p>
     <w:p>
@@ -8306,7 +8305,7 @@
         </w:rPr>
       </w:pPr>
       <w:r>
-        <w:t>下列關於堆疊（Stack）資料結構，何者較正確？</w:t>
+        <w:t>下列哪項（些）關於數位音訊檔案的句子是正確的？</w:t>
       </w:r>
     </w:p>
     <w:p>
@@ -8349,7 +8348,7 @@
         <w:tab/>
         <w:t>(1)</w:t>
         <w:tab/>
-        <w:t>後進先出（LIFO）</w:t>
+        <w:t>取樣頻率愈高，還原音質通常愈接近原聲</w:t>
       </w:r>
     </w:p>
     <w:p>
@@ -8374,7 +8373,7 @@
         <w:tab/>
         <w:t>(2)</w:t>
         <w:tab/>
-        <w:t>push 把元素放到堆疊頂端</w:t>
+        <w:t>取樣精度愈高，每個取樣點可記錄的層次愈多</w:t>
       </w:r>
     </w:p>
     <w:p>
@@ -8399,7 +8398,7 @@
         <w:tab/>
         <w:t>(3)</w:t>
         <w:tab/>
-        <w:t>pop 從堆疊頂端移除元素</w:t>
+        <w:t>立體聲比單聲道需要更多聲道資料</w:t>
       </w:r>
     </w:p>
     <w:p>
@@ -8642,7 +8641,7 @@
         </w:rPr>
       </w:pPr>
       <w:r>
-        <w:t>下列哪一項最能說明程序設計中「函數（Function）」的用途？</w:t>
+        <w:t>下列哪項是十進位 10 的二進制表示？</w:t>
       </w:r>
     </w:p>
     <w:p>
@@ -8682,7 +8681,7 @@
         <w:tab/>
         <w:t>A.</w:t>
         <w:tab/>
-        <w:t>只能處理單一數值</w:t>
+        <w:t>1100</w:t>
       </w:r>
     </w:p>
     <w:p>
@@ -8705,7 +8704,7 @@
         <w:tab/>
         <w:t>B.</w:t>
         <w:tab/>
-        <w:t>把所有變數改為全域變數</w:t>
+        <w:t>1010</w:t>
       </w:r>
     </w:p>
     <w:p>
@@ -8728,7 +8727,7 @@
         <w:tab/>
         <w:t>C.</w:t>
         <w:tab/>
-        <w:t>把程式拆成可重複呼叫的模組以提升可讀性與重用</w:t>
+        <w:t>1001</w:t>
       </w:r>
     </w:p>
     <w:p>
@@ -8751,7 +8750,7 @@
         <w:tab/>
         <w:t>D.</w:t>
         <w:tab/>
-        <w:t>刪除所有迴圈</w:t>
+        <w:t>0011</w:t>
       </w:r>
     </w:p>
     <w:p>
@@ -8810,7 +8809,7 @@
         </w:rPr>
       </w:pPr>
       <w:r>
-        <w:t>資料表 Book(ISBN, Title) 與 BookCopy(CopyID, ISBN, Shelf, Status)。</w:t>
+        <w:t>某公司要把銷售數據製成月報表供管理層決策。</w:t>
       </w:r>
     </w:p>
     <w:p>
@@ -8848,49 +8847,7 @@
         </w:rPr>
       </w:pPr>
       <w:r>
-        <w:tab/>
-        <w:tab/>
-        <w:t>要列出 Status =「在架」的書名 Title，</w:t>
-      </w:r>
-    </w:p>
-    <w:p>
-      <w:pPr>
-        <w:tabs>
-          <w:tab w:val="left" w:pos="567"/>
-          <w:tab w:val="left" w:pos="993"/>
-          <w:tab w:val="left" w:pos="1418"/>
-          <w:tab w:val="left" w:pos="1843"/>
-          <w:tab w:val="left" w:pos="2268"/>
-        </w:tabs>
-        <w:snapToGrid w:val="0"/>
-        <w:ind w:left="567" w:hanging="567"/>
-        <w:rPr>
-          <w:spacing w:val="20"/>
-          <w:szCs w:val="20"/>
-        </w:rPr>
-      </w:pPr>
-      <w:r/>
-    </w:p>
-    <w:p>
-      <w:pPr>
-        <w:tabs>
-          <w:tab w:val="left" w:pos="567"/>
-          <w:tab w:val="left" w:pos="993"/>
-          <w:tab w:val="left" w:pos="1418"/>
-          <w:tab w:val="left" w:pos="1843"/>
-          <w:tab w:val="left" w:pos="2268"/>
-        </w:tabs>
-        <w:snapToGrid w:val="0"/>
-        <w:ind w:left="567" w:hanging="567"/>
-        <w:rPr>
-          <w:spacing w:val="20"/>
-          <w:szCs w:val="20"/>
-        </w:rPr>
-      </w:pPr>
-      <w:r>
-        <w:tab/>
-        <w:tab/>
-        <w:t>下列 SQL 概念組合何者最適合？</w:t>
+        <w:t>此過程涉及下列哪（些）資訊處理階段？</w:t>
       </w:r>
     </w:p>
     <w:p>
@@ -8932,7 +8889,7 @@
         <w:tab/>
         <w:t>(1)</w:t>
         <w:tab/>
-        <w:t>INNER JOIN Book 與 BookCopy</w:t>
+        <w:t>輸入銷售數據</w:t>
       </w:r>
     </w:p>
     <w:p>
@@ -8956,7 +8913,7 @@
         <w:tab/>
         <w:t>(2)</w:t>
         <w:tab/>
-        <w:t>WHERE Status = '在架'</w:t>
+        <w:t>處理：計算總額與分類</w:t>
       </w:r>
     </w:p>
     <w:p>
@@ -8980,8 +8937,44 @@
         <w:tab/>
         <w:t>(3)</w:t>
         <w:tab/>
-        <w:t>SELECT Title</w:t>
+        <w:t>輸出月報表</w:t>
       </w:r>
+    </w:p>
+    <w:p>
+      <w:pPr>
+        <w:tabs>
+          <w:tab w:val="left" w:pos="567"/>
+          <w:tab w:val="left" w:pos="993"/>
+          <w:tab w:val="left" w:pos="1418"/>
+          <w:tab w:val="left" w:pos="1843"/>
+          <w:tab w:val="left" w:pos="2268"/>
+        </w:tabs>
+        <w:snapToGrid w:val="0"/>
+        <w:ind w:left="567" w:hanging="567"/>
+        <w:rPr>
+          <w:spacing w:val="20"/>
+          <w:szCs w:val="20"/>
+        </w:rPr>
+      </w:pPr>
+      <w:r/>
+    </w:p>
+    <w:p>
+      <w:pPr>
+        <w:tabs>
+          <w:tab w:val="left" w:pos="567"/>
+          <w:tab w:val="left" w:pos="993"/>
+          <w:tab w:val="left" w:pos="1418"/>
+          <w:tab w:val="left" w:pos="1843"/>
+          <w:tab w:val="left" w:pos="2268"/>
+        </w:tabs>
+        <w:snapToGrid w:val="0"/>
+        <w:ind w:left="567" w:hanging="567"/>
+        <w:rPr>
+          <w:spacing w:val="20"/>
+          <w:szCs w:val="20"/>
+        </w:rPr>
+      </w:pPr>
+      <w:r/>
     </w:p>
     <w:p>
       <w:pPr>
@@ -12483,7 +12476,7 @@
       <w:r>
         <w:t>(b)</w:t>
         <w:tab/>
-        <w:t>描述如何建立樞紐分析表：以「列」顯示產品類別；以「值」顯示總銷售額（對 F 欄總價求和）。</w:t>
+        <w:t>描述如何建立樞紐分析表：以「列」顯示產品類別；以「值」顯示總銷售額（對 F 欄求 SUM）。</w:t>
         <w:tab/>
         <w:t>(5 分)</w:t>
       </w:r>
@@ -12564,7 +12557,7 @@
       <w:r>
         <w:t>2.</w:t>
         <w:tab/>
-        <w:t>資訊保安與私隱</w:t>
+        <w:t>數據控制與私隱</w:t>
         <w:tab/>
         <w:t>(10 分)</w:t>
       </w:r>
@@ -12981,7 +12974,7 @@
       <w:r>
         <w:t>(a)</w:t>
         <w:tab/>
-        <w:t>列出強密碼的三項特徵，並說明為何「生日」不適合作密碼。</w:t>
+        <w:t>列出「有效性檢驗」與「奇偶檢測」的分別，並各舉一個輸入數據的例子。</w:t>
         <w:tab/>
         <w:t>(3 分)</w:t>
       </w:r>
@@ -13024,7 +13017,7 @@
       <w:r>
         <w:t>(b)</w:t>
         <w:tab/>
-        <w:t>比較「全備份」與「增量備份」：說明各自的備份範圍與還原時所需步驟。</w:t>
+        <w:t>比較「直接存取」與「順序存取」讀取檔案記錄的優缺點。</w:t>
         <w:tab/>
         <w:t>(4 分)</w:t>
       </w:r>
@@ -13087,7 +13080,7 @@
       <w:r>
         <w:t>(c)</w:t>
         <w:tab/>
-        <w:t>學校處理學生個人資料時，提出兩項符合私隱原則的做法並簡述原因。</w:t>
+        <w:t>學校收集學生健康申報資料時，提出兩項保障數據私隱的做法。</w:t>
         <w:tab/>
         <w:t>(3 分)</w:t>
       </w:r>
@@ -13345,7 +13338,7 @@
       <w:r>
         <w:t>(a)</w:t>
         <w:tab/>
-        <w:t>設 A = [10, 5, 20, 8, 20, 15]（n=6）。完成追蹤表，展示迴圈每次迭代後 largest 與 second_largest 的值。</w:t>
+        <w:t>設 A = [10, 5, 20, 8, 20, 15]（n=6）。完成追蹤表，展示每次迭代後 largest 與 second_largest 的值。</w:t>
         <w:tab/>
         <w:t>(5 分)</w:t>
       </w:r>
@@ -13542,7 +13535,7 @@
       <w:r>
         <w:t>(b)</w:t>
         <w:tab/>
-        <w:t>若陣列中最大值出現多次（如上例的 20），此算法是否仍能正確找出「次大值」？解釋原因。</w:t>
+        <w:t>若陣列中最大值出現多次（如上例的 20），此算法是否仍能正確找出「次大值」？解釋你的答案。</w:t>
         <w:tab/>
         <w:t>(5 分)</w:t>
       </w:r>

</xml_diff>